<commit_message>
Align Arabic and English PDF choices and short labels inline
</commit_message>
<xml_diff>
--- a/output/documents/fatca-crs-individual.docx
+++ b/output/documents/fatca-crs-individual.docx
@@ -244,10 +244,17 @@
           <w:p>
             <w:pPr>
               <w:keepNext w:val="0"/>
-              <w:spacing w:before="0" w:after="0" w:line="260" w:lineRule="exact"/>
-              <w:jc w:val="start"/>
-              <w:bidi/>
+              <w:spacing w:before="0" w:after="0" w:line="280" w:lineRule="exact"/>
+              <w:jc w:val="left"/>
             </w:pPr>
+            <w:r>
+              <w:rPr>
+                <w:rFonts w:ascii="Arial" w:hAnsi="Arial" w:cs="Bahij TheSansArabic Plain"/>
+                <w:b w:val="0"/>
+                <w:color w:val="242235"/>
+                <w:sz w:val="18"/>
+              </w:rPr>
+            </w:r>
             <w:r>
               <w:rPr>
                 <w:rFonts w:ascii="Bahij TheSansArabic Plain" w:hAnsi="Bahij TheSansArabic Plain" w:cs="Bahij TheSansArabic Plain"/>
@@ -258,15 +265,8 @@
                 <w:szCs w:val="19"/>
                 <w:bCs/>
               </w:rPr>
-              <w:t>اللقب</w:t>
-            </w:r>
-          </w:p>
-          <w:p>
-            <w:pPr>
-              <w:keepNext w:val="0"/>
-              <w:spacing w:before="0" w:after="0" w:line="240" w:lineRule="exact"/>
-              <w:jc w:val="left"/>
-            </w:pPr>
+              <w:t>⁧اللقب⁩</w:t>
+            </w:r>
             <w:r>
               <w:rPr>
                 <w:rFonts w:ascii="Arial" w:hAnsi="Arial" w:cs="Bahij TheSansArabic Plain"/>
@@ -274,7 +274,16 @@
                 <w:color w:val="656575"/>
                 <w:sz w:val="16"/>
               </w:rPr>
-              <w:t>Title</w:t>
+              <w:t xml:space="preserve"> / </w:t>
+            </w:r>
+            <w:r>
+              <w:rPr>
+                <w:rFonts w:ascii="Arial" w:hAnsi="Arial" w:cs="Bahij TheSansArabic Plain"/>
+                <w:b w:val="0"/>
+                <w:color w:val="656575"/>
+                <w:sz w:val="16"/>
+              </w:rPr>
+              <w:t>⁦Title⁩</w:t>
             </w:r>
           </w:p>
           <w:tbl>
@@ -336,23 +345,6 @@
                   </w:r>
                   <w:r>
                     <w:rPr>
-                      <w:rFonts w:ascii="Arial" w:hAnsi="Arial" w:cs="Bahij TheSansArabic Plain"/>
-                      <w:b w:val="0"/>
-                      <w:color w:val="242235"/>
-                      <w:sz w:val="16"/>
-                    </w:rPr>
-                    <w:t>Mr.</w:t>
-                  </w:r>
-                </w:p>
-                <w:p>
-                  <w:pPr>
-                    <w:keepNext w:val="0"/>
-                    <w:spacing w:before="0" w:after="0" w:line="260" w:lineRule="exact"/>
-                    <w:jc w:val="start"/>
-                    <w:bidi/>
-                  </w:pPr>
-                  <w:r>
-                    <w:rPr>
                       <w:rFonts w:ascii="Bahij TheSansArabic Plain" w:hAnsi="Bahij TheSansArabic Plain" w:cs="Bahij TheSansArabic Plain"/>
                       <w:b w:val="0"/>
                       <w:color w:val="242235"/>
@@ -360,7 +352,25 @@
                       <w:rtl/>
                       <w:szCs w:val="18"/>
                     </w:rPr>
-                    <w:t>السيد</w:t>
+                    <w:t>⁧السيد⁩</w:t>
+                  </w:r>
+                  <w:r>
+                    <w:rPr>
+                      <w:rFonts w:ascii="Arial" w:hAnsi="Arial" w:cs="Bahij TheSansArabic Plain"/>
+                      <w:b w:val="0"/>
+                      <w:color w:val="242235"/>
+                      <w:sz w:val="16"/>
+                    </w:rPr>
+                    <w:t xml:space="preserve"> / </w:t>
+                  </w:r>
+                  <w:r>
+                    <w:rPr>
+                      <w:rFonts w:ascii="Arial" w:hAnsi="Arial" w:cs="Bahij TheSansArabic Plain"/>
+                      <w:b w:val="0"/>
+                      <w:color w:val="242235"/>
+                      <w:sz w:val="16"/>
+                    </w:rPr>
+                    <w:t>⁦Mr.⁩</w:t>
                   </w:r>
                 </w:p>
               </w:tc>
@@ -400,23 +410,6 @@
                   </w:r>
                   <w:r>
                     <w:rPr>
-                      <w:rFonts w:ascii="Arial" w:hAnsi="Arial" w:cs="Bahij TheSansArabic Plain"/>
-                      <w:b w:val="0"/>
-                      <w:color w:val="242235"/>
-                      <w:sz w:val="16"/>
-                    </w:rPr>
-                    <w:t>Mrs.</w:t>
-                  </w:r>
-                </w:p>
-                <w:p>
-                  <w:pPr>
-                    <w:keepNext w:val="0"/>
-                    <w:spacing w:before="0" w:after="0" w:line="260" w:lineRule="exact"/>
-                    <w:jc w:val="start"/>
-                    <w:bidi/>
-                  </w:pPr>
-                  <w:r>
-                    <w:rPr>
                       <w:rFonts w:ascii="Bahij TheSansArabic Plain" w:hAnsi="Bahij TheSansArabic Plain" w:cs="Bahij TheSansArabic Plain"/>
                       <w:b w:val="0"/>
                       <w:color w:val="242235"/>
@@ -424,7 +417,25 @@
                       <w:rtl/>
                       <w:szCs w:val="18"/>
                     </w:rPr>
-                    <w:t>السيدة</w:t>
+                    <w:t>⁧السيدة⁩</w:t>
+                  </w:r>
+                  <w:r>
+                    <w:rPr>
+                      <w:rFonts w:ascii="Arial" w:hAnsi="Arial" w:cs="Bahij TheSansArabic Plain"/>
+                      <w:b w:val="0"/>
+                      <w:color w:val="242235"/>
+                      <w:sz w:val="16"/>
+                    </w:rPr>
+                    <w:t xml:space="preserve"> / </w:t>
+                  </w:r>
+                  <w:r>
+                    <w:rPr>
+                      <w:rFonts w:ascii="Arial" w:hAnsi="Arial" w:cs="Bahij TheSansArabic Plain"/>
+                      <w:b w:val="0"/>
+                      <w:color w:val="242235"/>
+                      <w:sz w:val="16"/>
+                    </w:rPr>
+                    <w:t>⁦Mrs.⁩</w:t>
                   </w:r>
                 </w:p>
               </w:tc>
@@ -469,23 +480,6 @@
                   </w:r>
                   <w:r>
                     <w:rPr>
-                      <w:rFonts w:ascii="Arial" w:hAnsi="Arial" w:cs="Bahij TheSansArabic Plain"/>
-                      <w:b w:val="0"/>
-                      <w:color w:val="242235"/>
-                      <w:sz w:val="16"/>
-                    </w:rPr>
-                    <w:t>Miss.</w:t>
-                  </w:r>
-                </w:p>
-                <w:p>
-                  <w:pPr>
-                    <w:keepNext w:val="0"/>
-                    <w:spacing w:before="0" w:after="0" w:line="260" w:lineRule="exact"/>
-                    <w:jc w:val="start"/>
-                    <w:bidi/>
-                  </w:pPr>
-                  <w:r>
-                    <w:rPr>
                       <w:rFonts w:ascii="Bahij TheSansArabic Plain" w:hAnsi="Bahij TheSansArabic Plain" w:cs="Bahij TheSansArabic Plain"/>
                       <w:b w:val="0"/>
                       <w:color w:val="242235"/>
@@ -493,7 +487,25 @@
                       <w:rtl/>
                       <w:szCs w:val="18"/>
                     </w:rPr>
-                    <w:t>الآنسة</w:t>
+                    <w:t>⁧الآنسة⁩</w:t>
+                  </w:r>
+                  <w:r>
+                    <w:rPr>
+                      <w:rFonts w:ascii="Arial" w:hAnsi="Arial" w:cs="Bahij TheSansArabic Plain"/>
+                      <w:b w:val="0"/>
+                      <w:color w:val="242235"/>
+                      <w:sz w:val="16"/>
+                    </w:rPr>
+                    <w:t xml:space="preserve"> / </w:t>
+                  </w:r>
+                  <w:r>
+                    <w:rPr>
+                      <w:rFonts w:ascii="Arial" w:hAnsi="Arial" w:cs="Bahij TheSansArabic Plain"/>
+                      <w:b w:val="0"/>
+                      <w:color w:val="242235"/>
+                      <w:sz w:val="16"/>
+                    </w:rPr>
+                    <w:t>⁦Miss.⁩</w:t>
                   </w:r>
                 </w:p>
               </w:tc>
@@ -533,23 +545,6 @@
                   </w:r>
                   <w:r>
                     <w:rPr>
-                      <w:rFonts w:ascii="Arial" w:hAnsi="Arial" w:cs="Bahij TheSansArabic Plain"/>
-                      <w:b w:val="0"/>
-                      <w:color w:val="242235"/>
-                      <w:sz w:val="16"/>
-                    </w:rPr>
-                    <w:t>Other</w:t>
-                  </w:r>
-                </w:p>
-                <w:p>
-                  <w:pPr>
-                    <w:keepNext w:val="0"/>
-                    <w:spacing w:before="0" w:after="0" w:line="260" w:lineRule="exact"/>
-                    <w:jc w:val="start"/>
-                    <w:bidi/>
-                  </w:pPr>
-                  <w:r>
-                    <w:rPr>
                       <w:rFonts w:ascii="Bahij TheSansArabic Plain" w:hAnsi="Bahij TheSansArabic Plain" w:cs="Bahij TheSansArabic Plain"/>
                       <w:b w:val="0"/>
                       <w:color w:val="242235"/>
@@ -557,7 +552,25 @@
                       <w:rtl/>
                       <w:szCs w:val="18"/>
                     </w:rPr>
-                    <w:t>آخر</w:t>
+                    <w:t>⁧آخر⁩</w:t>
+                  </w:r>
+                  <w:r>
+                    <w:rPr>
+                      <w:rFonts w:ascii="Arial" w:hAnsi="Arial" w:cs="Bahij TheSansArabic Plain"/>
+                      <w:b w:val="0"/>
+                      <w:color w:val="242235"/>
+                      <w:sz w:val="16"/>
+                    </w:rPr>
+                    <w:t xml:space="preserve"> / </w:t>
+                  </w:r>
+                  <w:r>
+                    <w:rPr>
+                      <w:rFonts w:ascii="Arial" w:hAnsi="Arial" w:cs="Bahij TheSansArabic Plain"/>
+                      <w:b w:val="0"/>
+                      <w:color w:val="242235"/>
+                      <w:sz w:val="16"/>
+                    </w:rPr>
+                    <w:t>⁦Other⁩</w:t>
                   </w:r>
                 </w:p>
               </w:tc>
@@ -677,10 +690,17 @@
           <w:p>
             <w:pPr>
               <w:keepNext w:val="0"/>
-              <w:spacing w:before="0" w:after="0" w:line="260" w:lineRule="exact"/>
-              <w:jc w:val="start"/>
-              <w:bidi/>
+              <w:spacing w:before="0" w:after="0" w:line="280" w:lineRule="exact"/>
+              <w:jc w:val="left"/>
             </w:pPr>
+            <w:r>
+              <w:rPr>
+                <w:rFonts w:ascii="Arial" w:hAnsi="Arial" w:cs="Bahij TheSansArabic Plain"/>
+                <w:b w:val="0"/>
+                <w:color w:val="242235"/>
+                <w:sz w:val="18"/>
+              </w:rPr>
+            </w:r>
             <w:r>
               <w:rPr>
                 <w:rFonts w:ascii="Bahij TheSansArabic Plain" w:hAnsi="Bahij TheSansArabic Plain" w:cs="Bahij TheSansArabic Plain"/>
@@ -690,15 +710,17 @@
                 <w:rtl/>
                 <w:szCs w:val="19"/>
               </w:rPr>
-              <w:t>اسم العائلة</w:t>
-            </w:r>
-          </w:p>
-          <w:p>
-            <w:pPr>
-              <w:keepNext w:val="0"/>
-              <w:spacing w:before="0" w:after="0" w:line="220" w:lineRule="exact"/>
-              <w:jc w:val="left"/>
-            </w:pPr>
+              <w:t>⁧اسم العائلة⁩</w:t>
+            </w:r>
+            <w:r>
+              <w:rPr>
+                <w:rFonts w:ascii="Arial" w:hAnsi="Arial" w:cs="Bahij TheSansArabic Plain"/>
+                <w:b w:val="0"/>
+                <w:color w:val="656575"/>
+                <w:sz w:val="16"/>
+              </w:rPr>
+              <w:t xml:space="preserve"> / </w:t>
+            </w:r>
             <w:r>
               <w:rPr>
                 <w:rFonts w:ascii="Arial" w:hAnsi="Arial" w:cs="Bahij TheSansArabic Plain"/>
@@ -706,7 +728,7 @@
                 <w:color w:val="656575"/>
                 <w:sz w:val="15"/>
               </w:rPr>
-              <w:t>Family name</w:t>
+              <w:t>⁦Family name⁩</w:t>
             </w:r>
           </w:p>
           <w:p>
@@ -819,10 +841,17 @@
           <w:p>
             <w:pPr>
               <w:keepNext w:val="0"/>
-              <w:spacing w:before="0" w:after="0" w:line="260" w:lineRule="exact"/>
-              <w:jc w:val="start"/>
-              <w:bidi/>
+              <w:spacing w:before="0" w:after="0" w:line="280" w:lineRule="exact"/>
+              <w:jc w:val="left"/>
             </w:pPr>
+            <w:r>
+              <w:rPr>
+                <w:rFonts w:ascii="Arial" w:hAnsi="Arial" w:cs="Bahij TheSansArabic Plain"/>
+                <w:b w:val="0"/>
+                <w:color w:val="242235"/>
+                <w:sz w:val="18"/>
+              </w:rPr>
+            </w:r>
             <w:r>
               <w:rPr>
                 <w:rFonts w:ascii="Bahij TheSansArabic Plain" w:hAnsi="Bahij TheSansArabic Plain" w:cs="Bahij TheSansArabic Plain"/>
@@ -832,15 +861,17 @@
                 <w:rtl/>
                 <w:szCs w:val="19"/>
               </w:rPr>
-              <w:t>الاسم الأول</w:t>
-            </w:r>
-          </w:p>
-          <w:p>
-            <w:pPr>
-              <w:keepNext w:val="0"/>
-              <w:spacing w:before="0" w:after="0" w:line="220" w:lineRule="exact"/>
-              <w:jc w:val="left"/>
-            </w:pPr>
+              <w:t>⁧الاسم الأول⁩</w:t>
+            </w:r>
+            <w:r>
+              <w:rPr>
+                <w:rFonts w:ascii="Arial" w:hAnsi="Arial" w:cs="Bahij TheSansArabic Plain"/>
+                <w:b w:val="0"/>
+                <w:color w:val="656575"/>
+                <w:sz w:val="16"/>
+              </w:rPr>
+              <w:t xml:space="preserve"> / </w:t>
+            </w:r>
             <w:r>
               <w:rPr>
                 <w:rFonts w:ascii="Arial" w:hAnsi="Arial" w:cs="Bahij TheSansArabic Plain"/>
@@ -848,7 +879,7 @@
                 <w:color w:val="656575"/>
                 <w:sz w:val="15"/>
               </w:rPr>
-              <w:t>First name</w:t>
+              <w:t>⁦First name⁩</w:t>
             </w:r>
           </w:p>
           <w:p>
@@ -974,10 +1005,17 @@
           <w:p>
             <w:pPr>
               <w:keepNext w:val="0"/>
-              <w:spacing w:before="0" w:after="0" w:line="260" w:lineRule="exact"/>
-              <w:jc w:val="start"/>
-              <w:bidi/>
+              <w:spacing w:before="0" w:after="0" w:line="280" w:lineRule="exact"/>
+              <w:jc w:val="left"/>
             </w:pPr>
+            <w:r>
+              <w:rPr>
+                <w:rFonts w:ascii="Arial" w:hAnsi="Arial" w:cs="Bahij TheSansArabic Plain"/>
+                <w:b w:val="0"/>
+                <w:color w:val="242235"/>
+                <w:sz w:val="18"/>
+              </w:rPr>
+            </w:r>
             <w:r>
               <w:rPr>
                 <w:rFonts w:ascii="Bahij TheSansArabic Plain" w:hAnsi="Bahij TheSansArabic Plain" w:cs="Bahij TheSansArabic Plain"/>
@@ -987,15 +1025,17 @@
                 <w:rtl/>
                 <w:szCs w:val="19"/>
               </w:rPr>
-              <w:t>الاسم الأول</w:t>
-            </w:r>
-          </w:p>
-          <w:p>
-            <w:pPr>
-              <w:keepNext w:val="0"/>
-              <w:spacing w:before="0" w:after="0" w:line="220" w:lineRule="exact"/>
-              <w:jc w:val="left"/>
-            </w:pPr>
+              <w:t>⁧الاسم الأول⁩</w:t>
+            </w:r>
+            <w:r>
+              <w:rPr>
+                <w:rFonts w:ascii="Arial" w:hAnsi="Arial" w:cs="Bahij TheSansArabic Plain"/>
+                <w:b w:val="0"/>
+                <w:color w:val="656575"/>
+                <w:sz w:val="16"/>
+              </w:rPr>
+              <w:t xml:space="preserve"> / </w:t>
+            </w:r>
             <w:r>
               <w:rPr>
                 <w:rFonts w:ascii="Arial" w:hAnsi="Arial" w:cs="Bahij TheSansArabic Plain"/>
@@ -1003,7 +1043,7 @@
                 <w:color w:val="656575"/>
                 <w:sz w:val="15"/>
               </w:rPr>
-              <w:t>First name</w:t>
+              <w:t>⁦First name⁩</w:t>
             </w:r>
           </w:p>
           <w:p>
@@ -1116,10 +1156,17 @@
           <w:p>
             <w:pPr>
               <w:keepNext w:val="0"/>
-              <w:spacing w:before="0" w:after="0" w:line="260" w:lineRule="exact"/>
-              <w:jc w:val="start"/>
-              <w:bidi/>
+              <w:spacing w:before="0" w:after="0" w:line="280" w:lineRule="exact"/>
+              <w:jc w:val="left"/>
             </w:pPr>
+            <w:r>
+              <w:rPr>
+                <w:rFonts w:ascii="Arial" w:hAnsi="Arial" w:cs="Bahij TheSansArabic Plain"/>
+                <w:b w:val="0"/>
+                <w:color w:val="242235"/>
+                <w:sz w:val="18"/>
+              </w:rPr>
+            </w:r>
             <w:r>
               <w:rPr>
                 <w:rFonts w:ascii="Bahij TheSansArabic Plain" w:hAnsi="Bahij TheSansArabic Plain" w:cs="Bahij TheSansArabic Plain"/>
@@ -1129,15 +1176,17 @@
                 <w:rtl/>
                 <w:szCs w:val="19"/>
               </w:rPr>
-              <w:t>اسم العائلة</w:t>
-            </w:r>
-          </w:p>
-          <w:p>
-            <w:pPr>
-              <w:keepNext w:val="0"/>
-              <w:spacing w:before="0" w:after="0" w:line="220" w:lineRule="exact"/>
-              <w:jc w:val="left"/>
-            </w:pPr>
+              <w:t>⁧اسم العائلة⁩</w:t>
+            </w:r>
+            <w:r>
+              <w:rPr>
+                <w:rFonts w:ascii="Arial" w:hAnsi="Arial" w:cs="Bahij TheSansArabic Plain"/>
+                <w:b w:val="0"/>
+                <w:color w:val="656575"/>
+                <w:sz w:val="16"/>
+              </w:rPr>
+              <w:t xml:space="preserve"> / </w:t>
+            </w:r>
             <w:r>
               <w:rPr>
                 <w:rFonts w:ascii="Arial" w:hAnsi="Arial" w:cs="Bahij TheSansArabic Plain"/>
@@ -1145,7 +1194,7 @@
                 <w:color w:val="656575"/>
                 <w:sz w:val="15"/>
               </w:rPr>
-              <w:t>Family name</w:t>
+              <w:t>⁦Family name⁩</w:t>
             </w:r>
           </w:p>
           <w:p>
@@ -1227,10 +1276,17 @@
           <w:p>
             <w:pPr>
               <w:keepNext w:val="0"/>
-              <w:spacing w:before="0" w:after="0" w:line="260" w:lineRule="exact"/>
-              <w:jc w:val="start"/>
-              <w:bidi/>
+              <w:spacing w:before="0" w:after="0" w:line="280" w:lineRule="exact"/>
+              <w:jc w:val="left"/>
             </w:pPr>
+            <w:r>
+              <w:rPr>
+                <w:rFonts w:ascii="Arial" w:hAnsi="Arial" w:cs="Bahij TheSansArabic Plain"/>
+                <w:b w:val="0"/>
+                <w:color w:val="242235"/>
+                <w:sz w:val="18"/>
+              </w:rPr>
+            </w:r>
             <w:r>
               <w:rPr>
                 <w:rFonts w:ascii="Bahij TheSansArabic Plain" w:hAnsi="Bahij TheSansArabic Plain" w:cs="Bahij TheSansArabic Plain"/>
@@ -1240,15 +1296,17 @@
                 <w:rtl/>
                 <w:szCs w:val="19"/>
               </w:rPr>
-              <w:t>تاريخ الميلاد: (الميلادي)</w:t>
-            </w:r>
-          </w:p>
-          <w:p>
-            <w:pPr>
-              <w:keepNext w:val="0"/>
-              <w:spacing w:before="0" w:after="0" w:line="220" w:lineRule="exact"/>
-              <w:jc w:val="left"/>
-            </w:pPr>
+              <w:t>⁧تاريخ الميلاد: (الميلادي)⁩</w:t>
+            </w:r>
+            <w:r>
+              <w:rPr>
+                <w:rFonts w:ascii="Arial" w:hAnsi="Arial" w:cs="Bahij TheSansArabic Plain"/>
+                <w:b w:val="0"/>
+                <w:color w:val="656575"/>
+                <w:sz w:val="16"/>
+              </w:rPr>
+              <w:t xml:space="preserve"> / </w:t>
+            </w:r>
             <w:r>
               <w:rPr>
                 <w:rFonts w:ascii="Arial" w:hAnsi="Arial" w:cs="Bahij TheSansArabic Plain"/>
@@ -1256,7 +1314,7 @@
                 <w:color w:val="656575"/>
                 <w:sz w:val="15"/>
               </w:rPr>
-              <w:t>Date of Birth: (Gregorian/Western)</w:t>
+              <w:t>⁦Date of Birth: (Gregorian/Western)⁩</w:t>
             </w:r>
           </w:p>
           <w:p>
@@ -1337,10 +1395,17 @@
           <w:p>
             <w:pPr>
               <w:keepNext w:val="0"/>
-              <w:spacing w:before="0" w:after="0" w:line="260" w:lineRule="exact"/>
-              <w:jc w:val="start"/>
-              <w:bidi/>
+              <w:spacing w:before="0" w:after="0" w:line="280" w:lineRule="exact"/>
+              <w:jc w:val="left"/>
             </w:pPr>
+            <w:r>
+              <w:rPr>
+                <w:rFonts w:ascii="Arial" w:hAnsi="Arial" w:cs="Bahij TheSansArabic Plain"/>
+                <w:b w:val="0"/>
+                <w:color w:val="242235"/>
+                <w:sz w:val="18"/>
+              </w:rPr>
+            </w:r>
             <w:r>
               <w:rPr>
                 <w:rFonts w:ascii="Bahij TheSansArabic Plain" w:hAnsi="Bahij TheSansArabic Plain" w:cs="Bahij TheSansArabic Plain"/>
@@ -1351,15 +1416,8 @@
                 <w:szCs w:val="19"/>
                 <w:bCs/>
               </w:rPr>
-              <w:t>الجنس</w:t>
-            </w:r>
-          </w:p>
-          <w:p>
-            <w:pPr>
-              <w:keepNext w:val="0"/>
-              <w:spacing w:before="0" w:after="0" w:line="240" w:lineRule="exact"/>
-              <w:jc w:val="left"/>
-            </w:pPr>
+              <w:t>⁧الجنس⁩</w:t>
+            </w:r>
             <w:r>
               <w:rPr>
                 <w:rFonts w:ascii="Arial" w:hAnsi="Arial" w:cs="Bahij TheSansArabic Plain"/>
@@ -1367,7 +1425,16 @@
                 <w:color w:val="656575"/>
                 <w:sz w:val="16"/>
               </w:rPr>
-              <w:t>Gender</w:t>
+              <w:t xml:space="preserve"> / </w:t>
+            </w:r>
+            <w:r>
+              <w:rPr>
+                <w:rFonts w:ascii="Arial" w:hAnsi="Arial" w:cs="Bahij TheSansArabic Plain"/>
+                <w:b w:val="0"/>
+                <w:color w:val="656575"/>
+                <w:sz w:val="16"/>
+              </w:rPr>
+              <w:t>⁦Gender⁩</w:t>
             </w:r>
           </w:p>
           <w:tbl>
@@ -1429,23 +1496,6 @@
                   </w:r>
                   <w:r>
                     <w:rPr>
-                      <w:rFonts w:ascii="Arial" w:hAnsi="Arial" w:cs="Bahij TheSansArabic Plain"/>
-                      <w:b w:val="0"/>
-                      <w:color w:val="242235"/>
-                      <w:sz w:val="16"/>
-                    </w:rPr>
-                    <w:t>Female</w:t>
-                  </w:r>
-                </w:p>
-                <w:p>
-                  <w:pPr>
-                    <w:keepNext w:val="0"/>
-                    <w:spacing w:before="0" w:after="0" w:line="260" w:lineRule="exact"/>
-                    <w:jc w:val="start"/>
-                    <w:bidi/>
-                  </w:pPr>
-                  <w:r>
-                    <w:rPr>
                       <w:rFonts w:ascii="Bahij TheSansArabic Plain" w:hAnsi="Bahij TheSansArabic Plain" w:cs="Bahij TheSansArabic Plain"/>
                       <w:b w:val="0"/>
                       <w:color w:val="242235"/>
@@ -1453,7 +1503,25 @@
                       <w:rtl/>
                       <w:szCs w:val="18"/>
                     </w:rPr>
-                    <w:t>أنثى</w:t>
+                    <w:t>⁧أنثى⁩</w:t>
+                  </w:r>
+                  <w:r>
+                    <w:rPr>
+                      <w:rFonts w:ascii="Arial" w:hAnsi="Arial" w:cs="Bahij TheSansArabic Plain"/>
+                      <w:b w:val="0"/>
+                      <w:color w:val="242235"/>
+                      <w:sz w:val="16"/>
+                    </w:rPr>
+                    <w:t xml:space="preserve"> / </w:t>
+                  </w:r>
+                  <w:r>
+                    <w:rPr>
+                      <w:rFonts w:ascii="Arial" w:hAnsi="Arial" w:cs="Bahij TheSansArabic Plain"/>
+                      <w:b w:val="0"/>
+                      <w:color w:val="242235"/>
+                      <w:sz w:val="16"/>
+                    </w:rPr>
+                    <w:t>⁦Female⁩</w:t>
                   </w:r>
                 </w:p>
               </w:tc>
@@ -1493,23 +1561,6 @@
                   </w:r>
                   <w:r>
                     <w:rPr>
-                      <w:rFonts w:ascii="Arial" w:hAnsi="Arial" w:cs="Bahij TheSansArabic Plain"/>
-                      <w:b w:val="0"/>
-                      <w:color w:val="242235"/>
-                      <w:sz w:val="16"/>
-                    </w:rPr>
-                    <w:t>Male</w:t>
-                  </w:r>
-                </w:p>
-                <w:p>
-                  <w:pPr>
-                    <w:keepNext w:val="0"/>
-                    <w:spacing w:before="0" w:after="0" w:line="260" w:lineRule="exact"/>
-                    <w:jc w:val="start"/>
-                    <w:bidi/>
-                  </w:pPr>
-                  <w:r>
-                    <w:rPr>
                       <w:rFonts w:ascii="Bahij TheSansArabic Plain" w:hAnsi="Bahij TheSansArabic Plain" w:cs="Bahij TheSansArabic Plain"/>
                       <w:b w:val="0"/>
                       <w:color w:val="242235"/>
@@ -1517,7 +1568,25 @@
                       <w:rtl/>
                       <w:szCs w:val="18"/>
                     </w:rPr>
-                    <w:t>ذكر</w:t>
+                    <w:t>⁧ذكر⁩</w:t>
+                  </w:r>
+                  <w:r>
+                    <w:rPr>
+                      <w:rFonts w:ascii="Arial" w:hAnsi="Arial" w:cs="Bahij TheSansArabic Plain"/>
+                      <w:b w:val="0"/>
+                      <w:color w:val="242235"/>
+                      <w:sz w:val="16"/>
+                    </w:rPr>
+                    <w:t xml:space="preserve"> / </w:t>
+                  </w:r>
+                  <w:r>
+                    <w:rPr>
+                      <w:rFonts w:ascii="Arial" w:hAnsi="Arial" w:cs="Bahij TheSansArabic Plain"/>
+                      <w:b w:val="0"/>
+                      <w:color w:val="242235"/>
+                      <w:sz w:val="16"/>
+                    </w:rPr>
+                    <w:t>⁦Male⁩</w:t>
                   </w:r>
                 </w:p>
               </w:tc>
@@ -1665,10 +1734,17 @@
           <w:p>
             <w:pPr>
               <w:keepNext w:val="0"/>
-              <w:spacing w:before="0" w:after="0" w:line="260" w:lineRule="exact"/>
-              <w:jc w:val="start"/>
-              <w:bidi/>
+              <w:spacing w:before="0" w:after="0" w:line="280" w:lineRule="exact"/>
+              <w:jc w:val="left"/>
             </w:pPr>
+            <w:r>
+              <w:rPr>
+                <w:rFonts w:ascii="Arial" w:hAnsi="Arial" w:cs="Bahij TheSansArabic Plain"/>
+                <w:b w:val="0"/>
+                <w:color w:val="242235"/>
+                <w:sz w:val="18"/>
+              </w:rPr>
+            </w:r>
             <w:r>
               <w:rPr>
                 <w:rFonts w:ascii="Bahij TheSansArabic Plain" w:hAnsi="Bahij TheSansArabic Plain" w:cs="Bahij TheSansArabic Plain"/>
@@ -1678,15 +1754,17 @@
                 <w:rtl/>
                 <w:szCs w:val="19"/>
               </w:rPr>
-              <w:t>بلد الميلاد</w:t>
-            </w:r>
-          </w:p>
-          <w:p>
-            <w:pPr>
-              <w:keepNext w:val="0"/>
-              <w:spacing w:before="0" w:after="0" w:line="220" w:lineRule="exact"/>
-              <w:jc w:val="left"/>
-            </w:pPr>
+              <w:t>⁧بلد الميلاد⁩</w:t>
+            </w:r>
+            <w:r>
+              <w:rPr>
+                <w:rFonts w:ascii="Arial" w:hAnsi="Arial" w:cs="Bahij TheSansArabic Plain"/>
+                <w:b w:val="0"/>
+                <w:color w:val="656575"/>
+                <w:sz w:val="16"/>
+              </w:rPr>
+              <w:t xml:space="preserve"> / </w:t>
+            </w:r>
             <w:r>
               <w:rPr>
                 <w:rFonts w:ascii="Arial" w:hAnsi="Arial" w:cs="Bahij TheSansArabic Plain"/>
@@ -1694,7 +1772,7 @@
                 <w:color w:val="656575"/>
                 <w:sz w:val="15"/>
               </w:rPr>
-              <w:t>Country of Birth</w:t>
+              <w:t>⁦Country of Birth⁩</w:t>
             </w:r>
           </w:p>
           <w:p>
@@ -1819,10 +1897,17 @@
           <w:p>
             <w:pPr>
               <w:keepNext w:val="0"/>
-              <w:spacing w:before="0" w:after="0" w:line="260" w:lineRule="exact"/>
-              <w:jc w:val="start"/>
-              <w:bidi/>
+              <w:spacing w:before="0" w:after="0" w:line="280" w:lineRule="exact"/>
+              <w:jc w:val="left"/>
             </w:pPr>
+            <w:r>
+              <w:rPr>
+                <w:rFonts w:ascii="Arial" w:hAnsi="Arial" w:cs="Bahij TheSansArabic Plain"/>
+                <w:b w:val="0"/>
+                <w:color w:val="242235"/>
+                <w:sz w:val="18"/>
+              </w:rPr>
+            </w:r>
             <w:r>
               <w:rPr>
                 <w:rFonts w:ascii="Bahij TheSansArabic Plain" w:hAnsi="Bahij TheSansArabic Plain" w:cs="Bahij TheSansArabic Plain"/>
@@ -1832,15 +1917,17 @@
                 <w:rtl/>
                 <w:szCs w:val="19"/>
               </w:rPr>
-              <w:t>المبنى</w:t>
-            </w:r>
-          </w:p>
-          <w:p>
-            <w:pPr>
-              <w:keepNext w:val="0"/>
-              <w:spacing w:before="0" w:after="0" w:line="220" w:lineRule="exact"/>
-              <w:jc w:val="left"/>
-            </w:pPr>
+              <w:t>⁧المبنى⁩</w:t>
+            </w:r>
+            <w:r>
+              <w:rPr>
+                <w:rFonts w:ascii="Arial" w:hAnsi="Arial" w:cs="Bahij TheSansArabic Plain"/>
+                <w:b w:val="0"/>
+                <w:color w:val="656575"/>
+                <w:sz w:val="16"/>
+              </w:rPr>
+              <w:t xml:space="preserve"> / </w:t>
+            </w:r>
             <w:r>
               <w:rPr>
                 <w:rFonts w:ascii="Arial" w:hAnsi="Arial" w:cs="Bahij TheSansArabic Plain"/>
@@ -1848,7 +1935,7 @@
                 <w:color w:val="656575"/>
                 <w:sz w:val="15"/>
               </w:rPr>
-              <w:t>Building #</w:t>
+              <w:t>⁦Building #⁩</w:t>
             </w:r>
           </w:p>
           <w:p>
@@ -1890,10 +1977,17 @@
           <w:p>
             <w:pPr>
               <w:keepNext w:val="0"/>
-              <w:spacing w:before="0" w:after="0" w:line="260" w:lineRule="exact"/>
-              <w:jc w:val="start"/>
-              <w:bidi/>
+              <w:spacing w:before="0" w:after="0" w:line="280" w:lineRule="exact"/>
+              <w:jc w:val="left"/>
             </w:pPr>
+            <w:r>
+              <w:rPr>
+                <w:rFonts w:ascii="Arial" w:hAnsi="Arial" w:cs="Bahij TheSansArabic Plain"/>
+                <w:b w:val="0"/>
+                <w:color w:val="242235"/>
+                <w:sz w:val="18"/>
+              </w:rPr>
+            </w:r>
             <w:r>
               <w:rPr>
                 <w:rFonts w:ascii="Bahij TheSansArabic Plain" w:hAnsi="Bahij TheSansArabic Plain" w:cs="Bahij TheSansArabic Plain"/>
@@ -1903,15 +1997,17 @@
                 <w:rtl/>
                 <w:szCs w:val="19"/>
               </w:rPr>
-              <w:t>اسم الشارع</w:t>
-            </w:r>
-          </w:p>
-          <w:p>
-            <w:pPr>
-              <w:keepNext w:val="0"/>
-              <w:spacing w:before="0" w:after="0" w:line="220" w:lineRule="exact"/>
-              <w:jc w:val="left"/>
-            </w:pPr>
+              <w:t>⁧اسم الشارع⁩</w:t>
+            </w:r>
+            <w:r>
+              <w:rPr>
+                <w:rFonts w:ascii="Arial" w:hAnsi="Arial" w:cs="Bahij TheSansArabic Plain"/>
+                <w:b w:val="0"/>
+                <w:color w:val="656575"/>
+                <w:sz w:val="16"/>
+              </w:rPr>
+              <w:t xml:space="preserve"> / </w:t>
+            </w:r>
             <w:r>
               <w:rPr>
                 <w:rFonts w:ascii="Arial" w:hAnsi="Arial" w:cs="Bahij TheSansArabic Plain"/>
@@ -1919,7 +2015,7 @@
                 <w:color w:val="656575"/>
                 <w:sz w:val="15"/>
               </w:rPr>
-              <w:t>Street Name</w:t>
+              <w:t>⁦Street Name⁩</w:t>
             </w:r>
           </w:p>
           <w:p>
@@ -2002,10 +2098,17 @@
           <w:p>
             <w:pPr>
               <w:keepNext w:val="0"/>
-              <w:spacing w:before="0" w:after="0" w:line="260" w:lineRule="exact"/>
-              <w:jc w:val="start"/>
-              <w:bidi/>
+              <w:spacing w:before="0" w:after="0" w:line="280" w:lineRule="exact"/>
+              <w:jc w:val="left"/>
             </w:pPr>
+            <w:r>
+              <w:rPr>
+                <w:rFonts w:ascii="Arial" w:hAnsi="Arial" w:cs="Bahij TheSansArabic Plain"/>
+                <w:b w:val="0"/>
+                <w:color w:val="242235"/>
+                <w:sz w:val="18"/>
+              </w:rPr>
+            </w:r>
             <w:r>
               <w:rPr>
                 <w:rFonts w:ascii="Bahij TheSansArabic Plain" w:hAnsi="Bahij TheSansArabic Plain" w:cs="Bahij TheSansArabic Plain"/>
@@ -2015,15 +2118,17 @@
                 <w:rtl/>
                 <w:szCs w:val="19"/>
               </w:rPr>
-              <w:t>المنطقة</w:t>
-            </w:r>
-          </w:p>
-          <w:p>
-            <w:pPr>
-              <w:keepNext w:val="0"/>
-              <w:spacing w:before="0" w:after="0" w:line="220" w:lineRule="exact"/>
-              <w:jc w:val="left"/>
-            </w:pPr>
+              <w:t>⁧المنطقة⁩</w:t>
+            </w:r>
+            <w:r>
+              <w:rPr>
+                <w:rFonts w:ascii="Arial" w:hAnsi="Arial" w:cs="Bahij TheSansArabic Plain"/>
+                <w:b w:val="0"/>
+                <w:color w:val="656575"/>
+                <w:sz w:val="16"/>
+              </w:rPr>
+              <w:t xml:space="preserve"> / </w:t>
+            </w:r>
             <w:r>
               <w:rPr>
                 <w:rFonts w:ascii="Arial" w:hAnsi="Arial" w:cs="Bahij TheSansArabic Plain"/>
@@ -2031,7 +2136,7 @@
                 <w:color w:val="656575"/>
                 <w:sz w:val="15"/>
               </w:rPr>
-              <w:t>District</w:t>
+              <w:t>⁦District⁩</w:t>
             </w:r>
           </w:p>
           <w:p>
@@ -2073,10 +2178,17 @@
           <w:p>
             <w:pPr>
               <w:keepNext w:val="0"/>
-              <w:spacing w:before="0" w:after="0" w:line="260" w:lineRule="exact"/>
-              <w:jc w:val="start"/>
-              <w:bidi/>
+              <w:spacing w:before="0" w:after="0" w:line="280" w:lineRule="exact"/>
+              <w:jc w:val="left"/>
             </w:pPr>
+            <w:r>
+              <w:rPr>
+                <w:rFonts w:ascii="Arial" w:hAnsi="Arial" w:cs="Bahij TheSansArabic Plain"/>
+                <w:b w:val="0"/>
+                <w:color w:val="242235"/>
+                <w:sz w:val="18"/>
+              </w:rPr>
+            </w:r>
             <w:r>
               <w:rPr>
                 <w:rFonts w:ascii="Bahij TheSansArabic Plain" w:hAnsi="Bahij TheSansArabic Plain" w:cs="Bahij TheSansArabic Plain"/>
@@ -2086,15 +2198,17 @@
                 <w:rtl/>
                 <w:szCs w:val="19"/>
               </w:rPr>
-              <w:t>الرمز البريدي</w:t>
-            </w:r>
-          </w:p>
-          <w:p>
-            <w:pPr>
-              <w:keepNext w:val="0"/>
-              <w:spacing w:before="0" w:after="0" w:line="220" w:lineRule="exact"/>
-              <w:jc w:val="left"/>
-            </w:pPr>
+              <w:t>⁧الرمز البريدي⁩</w:t>
+            </w:r>
+            <w:r>
+              <w:rPr>
+                <w:rFonts w:ascii="Arial" w:hAnsi="Arial" w:cs="Bahij TheSansArabic Plain"/>
+                <w:b w:val="0"/>
+                <w:color w:val="656575"/>
+                <w:sz w:val="16"/>
+              </w:rPr>
+              <w:t xml:space="preserve"> / </w:t>
+            </w:r>
             <w:r>
               <w:rPr>
                 <w:rFonts w:ascii="Arial" w:hAnsi="Arial" w:cs="Bahij TheSansArabic Plain"/>
@@ -2102,7 +2216,7 @@
                 <w:color w:val="656575"/>
                 <w:sz w:val="15"/>
               </w:rPr>
-              <w:t>Postal Code</w:t>
+              <w:t>⁦Postal Code⁩</w:t>
             </w:r>
           </w:p>
           <w:p>
@@ -2185,10 +2299,17 @@
           <w:p>
             <w:pPr>
               <w:keepNext w:val="0"/>
-              <w:spacing w:before="0" w:after="0" w:line="260" w:lineRule="exact"/>
-              <w:jc w:val="start"/>
-              <w:bidi/>
+              <w:spacing w:before="0" w:after="0" w:line="280" w:lineRule="exact"/>
+              <w:jc w:val="left"/>
             </w:pPr>
+            <w:r>
+              <w:rPr>
+                <w:rFonts w:ascii="Arial" w:hAnsi="Arial" w:cs="Bahij TheSansArabic Plain"/>
+                <w:b w:val="0"/>
+                <w:color w:val="242235"/>
+                <w:sz w:val="18"/>
+              </w:rPr>
+            </w:r>
             <w:r>
               <w:rPr>
                 <w:rFonts w:ascii="Bahij TheSansArabic Plain" w:hAnsi="Bahij TheSansArabic Plain" w:cs="Bahij TheSansArabic Plain"/>
@@ -2198,15 +2319,17 @@
                 <w:rtl/>
                 <w:szCs w:val="19"/>
               </w:rPr>
-              <w:t>المدينة</w:t>
-            </w:r>
-          </w:p>
-          <w:p>
-            <w:pPr>
-              <w:keepNext w:val="0"/>
-              <w:spacing w:before="0" w:after="0" w:line="220" w:lineRule="exact"/>
-              <w:jc w:val="left"/>
-            </w:pPr>
+              <w:t>⁧المدينة⁩</w:t>
+            </w:r>
+            <w:r>
+              <w:rPr>
+                <w:rFonts w:ascii="Arial" w:hAnsi="Arial" w:cs="Bahij TheSansArabic Plain"/>
+                <w:b w:val="0"/>
+                <w:color w:val="656575"/>
+                <w:sz w:val="16"/>
+              </w:rPr>
+              <w:t xml:space="preserve"> / </w:t>
+            </w:r>
             <w:r>
               <w:rPr>
                 <w:rFonts w:ascii="Arial" w:hAnsi="Arial" w:cs="Bahij TheSansArabic Plain"/>
@@ -2214,7 +2337,7 @@
                 <w:color w:val="656575"/>
                 <w:sz w:val="15"/>
               </w:rPr>
-              <w:t>City</w:t>
+              <w:t>⁦City⁩</w:t>
             </w:r>
           </w:p>
           <w:p>
@@ -2256,10 +2379,17 @@
           <w:p>
             <w:pPr>
               <w:keepNext w:val="0"/>
-              <w:spacing w:before="0" w:after="0" w:line="260" w:lineRule="exact"/>
-              <w:jc w:val="start"/>
-              <w:bidi/>
+              <w:spacing w:before="0" w:after="0" w:line="280" w:lineRule="exact"/>
+              <w:jc w:val="left"/>
             </w:pPr>
+            <w:r>
+              <w:rPr>
+                <w:rFonts w:ascii="Arial" w:hAnsi="Arial" w:cs="Bahij TheSansArabic Plain"/>
+                <w:b w:val="0"/>
+                <w:color w:val="242235"/>
+                <w:sz w:val="18"/>
+              </w:rPr>
+            </w:r>
             <w:r>
               <w:rPr>
                 <w:rFonts w:ascii="Bahij TheSansArabic Plain" w:hAnsi="Bahij TheSansArabic Plain" w:cs="Bahij TheSansArabic Plain"/>
@@ -2269,15 +2399,17 @@
                 <w:rtl/>
                 <w:szCs w:val="19"/>
               </w:rPr>
-              <w:t>الدولة</w:t>
-            </w:r>
-          </w:p>
-          <w:p>
-            <w:pPr>
-              <w:keepNext w:val="0"/>
-              <w:spacing w:before="0" w:after="0" w:line="220" w:lineRule="exact"/>
-              <w:jc w:val="left"/>
-            </w:pPr>
+              <w:t>⁧الدولة⁩</w:t>
+            </w:r>
+            <w:r>
+              <w:rPr>
+                <w:rFonts w:ascii="Arial" w:hAnsi="Arial" w:cs="Bahij TheSansArabic Plain"/>
+                <w:b w:val="0"/>
+                <w:color w:val="656575"/>
+                <w:sz w:val="16"/>
+              </w:rPr>
+              <w:t xml:space="preserve"> / </w:t>
+            </w:r>
             <w:r>
               <w:rPr>
                 <w:rFonts w:ascii="Arial" w:hAnsi="Arial" w:cs="Bahij TheSansArabic Plain"/>
@@ -2285,7 +2417,7 @@
                 <w:color w:val="656575"/>
                 <w:sz w:val="15"/>
               </w:rPr>
-              <w:t>Country</w:t>
+              <w:t>⁦Country⁩</w:t>
             </w:r>
           </w:p>
           <w:p>
@@ -2427,10 +2559,17 @@
           <w:p>
             <w:pPr>
               <w:keepNext w:val="0"/>
-              <w:spacing w:before="0" w:after="0" w:line="260" w:lineRule="exact"/>
-              <w:jc w:val="start"/>
-              <w:bidi/>
+              <w:spacing w:before="0" w:after="0" w:line="280" w:lineRule="exact"/>
+              <w:jc w:val="left"/>
             </w:pPr>
+            <w:r>
+              <w:rPr>
+                <w:rFonts w:ascii="Arial" w:hAnsi="Arial" w:cs="Bahij TheSansArabic Plain"/>
+                <w:b w:val="0"/>
+                <w:color w:val="242235"/>
+                <w:sz w:val="18"/>
+              </w:rPr>
+            </w:r>
             <w:r>
               <w:rPr>
                 <w:rFonts w:ascii="Bahij TheSansArabic Plain" w:hAnsi="Bahij TheSansArabic Plain" w:cs="Bahij TheSansArabic Plain"/>
@@ -2440,15 +2579,17 @@
                 <w:rtl/>
                 <w:szCs w:val="19"/>
               </w:rPr>
-              <w:t>المبنى</w:t>
-            </w:r>
-          </w:p>
-          <w:p>
-            <w:pPr>
-              <w:keepNext w:val="0"/>
-              <w:spacing w:before="0" w:after="0" w:line="220" w:lineRule="exact"/>
-              <w:jc w:val="left"/>
-            </w:pPr>
+              <w:t>⁧المبنى⁩</w:t>
+            </w:r>
+            <w:r>
+              <w:rPr>
+                <w:rFonts w:ascii="Arial" w:hAnsi="Arial" w:cs="Bahij TheSansArabic Plain"/>
+                <w:b w:val="0"/>
+                <w:color w:val="656575"/>
+                <w:sz w:val="16"/>
+              </w:rPr>
+              <w:t xml:space="preserve"> / </w:t>
+            </w:r>
             <w:r>
               <w:rPr>
                 <w:rFonts w:ascii="Arial" w:hAnsi="Arial" w:cs="Bahij TheSansArabic Plain"/>
@@ -2456,7 +2597,7 @@
                 <w:color w:val="656575"/>
                 <w:sz w:val="15"/>
               </w:rPr>
-              <w:t>Building #</w:t>
+              <w:t>⁦Building #⁩</w:t>
             </w:r>
           </w:p>
           <w:p>
@@ -2498,10 +2639,17 @@
           <w:p>
             <w:pPr>
               <w:keepNext w:val="0"/>
-              <w:spacing w:before="0" w:after="0" w:line="260" w:lineRule="exact"/>
-              <w:jc w:val="start"/>
-              <w:bidi/>
+              <w:spacing w:before="0" w:after="0" w:line="280" w:lineRule="exact"/>
+              <w:jc w:val="left"/>
             </w:pPr>
+            <w:r>
+              <w:rPr>
+                <w:rFonts w:ascii="Arial" w:hAnsi="Arial" w:cs="Bahij TheSansArabic Plain"/>
+                <w:b w:val="0"/>
+                <w:color w:val="242235"/>
+                <w:sz w:val="18"/>
+              </w:rPr>
+            </w:r>
             <w:r>
               <w:rPr>
                 <w:rFonts w:ascii="Bahij TheSansArabic Plain" w:hAnsi="Bahij TheSansArabic Plain" w:cs="Bahij TheSansArabic Plain"/>
@@ -2511,15 +2659,17 @@
                 <w:rtl/>
                 <w:szCs w:val="19"/>
               </w:rPr>
-              <w:t>اسم الشارع</w:t>
-            </w:r>
-          </w:p>
-          <w:p>
-            <w:pPr>
-              <w:keepNext w:val="0"/>
-              <w:spacing w:before="0" w:after="0" w:line="220" w:lineRule="exact"/>
-              <w:jc w:val="left"/>
-            </w:pPr>
+              <w:t>⁧اسم الشارع⁩</w:t>
+            </w:r>
+            <w:r>
+              <w:rPr>
+                <w:rFonts w:ascii="Arial" w:hAnsi="Arial" w:cs="Bahij TheSansArabic Plain"/>
+                <w:b w:val="0"/>
+                <w:color w:val="656575"/>
+                <w:sz w:val="16"/>
+              </w:rPr>
+              <w:t xml:space="preserve"> / </w:t>
+            </w:r>
             <w:r>
               <w:rPr>
                 <w:rFonts w:ascii="Arial" w:hAnsi="Arial" w:cs="Bahij TheSansArabic Plain"/>
@@ -2527,7 +2677,7 @@
                 <w:color w:val="656575"/>
                 <w:sz w:val="15"/>
               </w:rPr>
-              <w:t>Street Name</w:t>
+              <w:t>⁦Street Name⁩</w:t>
             </w:r>
           </w:p>
           <w:p>
@@ -2610,10 +2760,17 @@
           <w:p>
             <w:pPr>
               <w:keepNext w:val="0"/>
-              <w:spacing w:before="0" w:after="0" w:line="260" w:lineRule="exact"/>
-              <w:jc w:val="start"/>
-              <w:bidi/>
+              <w:spacing w:before="0" w:after="0" w:line="280" w:lineRule="exact"/>
+              <w:jc w:val="left"/>
             </w:pPr>
+            <w:r>
+              <w:rPr>
+                <w:rFonts w:ascii="Arial" w:hAnsi="Arial" w:cs="Bahij TheSansArabic Plain"/>
+                <w:b w:val="0"/>
+                <w:color w:val="242235"/>
+                <w:sz w:val="18"/>
+              </w:rPr>
+            </w:r>
             <w:r>
               <w:rPr>
                 <w:rFonts w:ascii="Bahij TheSansArabic Plain" w:hAnsi="Bahij TheSansArabic Plain" w:cs="Bahij TheSansArabic Plain"/>
@@ -2623,15 +2780,17 @@
                 <w:rtl/>
                 <w:szCs w:val="19"/>
               </w:rPr>
-              <w:t>المنطقة</w:t>
-            </w:r>
-          </w:p>
-          <w:p>
-            <w:pPr>
-              <w:keepNext w:val="0"/>
-              <w:spacing w:before="0" w:after="0" w:line="220" w:lineRule="exact"/>
-              <w:jc w:val="left"/>
-            </w:pPr>
+              <w:t>⁧المنطقة⁩</w:t>
+            </w:r>
+            <w:r>
+              <w:rPr>
+                <w:rFonts w:ascii="Arial" w:hAnsi="Arial" w:cs="Bahij TheSansArabic Plain"/>
+                <w:b w:val="0"/>
+                <w:color w:val="656575"/>
+                <w:sz w:val="16"/>
+              </w:rPr>
+              <w:t xml:space="preserve"> / </w:t>
+            </w:r>
             <w:r>
               <w:rPr>
                 <w:rFonts w:ascii="Arial" w:hAnsi="Arial" w:cs="Bahij TheSansArabic Plain"/>
@@ -2639,7 +2798,7 @@
                 <w:color w:val="656575"/>
                 <w:sz w:val="15"/>
               </w:rPr>
-              <w:t>District</w:t>
+              <w:t>⁦District⁩</w:t>
             </w:r>
           </w:p>
           <w:p>
@@ -2681,10 +2840,17 @@
           <w:p>
             <w:pPr>
               <w:keepNext w:val="0"/>
-              <w:spacing w:before="0" w:after="0" w:line="260" w:lineRule="exact"/>
-              <w:jc w:val="start"/>
-              <w:bidi/>
+              <w:spacing w:before="0" w:after="0" w:line="280" w:lineRule="exact"/>
+              <w:jc w:val="left"/>
             </w:pPr>
+            <w:r>
+              <w:rPr>
+                <w:rFonts w:ascii="Arial" w:hAnsi="Arial" w:cs="Bahij TheSansArabic Plain"/>
+                <w:b w:val="0"/>
+                <w:color w:val="242235"/>
+                <w:sz w:val="18"/>
+              </w:rPr>
+            </w:r>
             <w:r>
               <w:rPr>
                 <w:rFonts w:ascii="Bahij TheSansArabic Plain" w:hAnsi="Bahij TheSansArabic Plain" w:cs="Bahij TheSansArabic Plain"/>
@@ -2694,15 +2860,17 @@
                 <w:rtl/>
                 <w:szCs w:val="19"/>
               </w:rPr>
-              <w:t>الرمز البريدي</w:t>
-            </w:r>
-          </w:p>
-          <w:p>
-            <w:pPr>
-              <w:keepNext w:val="0"/>
-              <w:spacing w:before="0" w:after="0" w:line="220" w:lineRule="exact"/>
-              <w:jc w:val="left"/>
-            </w:pPr>
+              <w:t>⁧الرمز البريدي⁩</w:t>
+            </w:r>
+            <w:r>
+              <w:rPr>
+                <w:rFonts w:ascii="Arial" w:hAnsi="Arial" w:cs="Bahij TheSansArabic Plain"/>
+                <w:b w:val="0"/>
+                <w:color w:val="656575"/>
+                <w:sz w:val="16"/>
+              </w:rPr>
+              <w:t xml:space="preserve"> / </w:t>
+            </w:r>
             <w:r>
               <w:rPr>
                 <w:rFonts w:ascii="Arial" w:hAnsi="Arial" w:cs="Bahij TheSansArabic Plain"/>
@@ -2710,7 +2878,7 @@
                 <w:color w:val="656575"/>
                 <w:sz w:val="15"/>
               </w:rPr>
-              <w:t>Postal Code</w:t>
+              <w:t>⁦Postal Code⁩</w:t>
             </w:r>
           </w:p>
           <w:p>
@@ -2793,10 +2961,17 @@
           <w:p>
             <w:pPr>
               <w:keepNext w:val="0"/>
-              <w:spacing w:before="0" w:after="0" w:line="260" w:lineRule="exact"/>
-              <w:jc w:val="start"/>
-              <w:bidi/>
+              <w:spacing w:before="0" w:after="0" w:line="280" w:lineRule="exact"/>
+              <w:jc w:val="left"/>
             </w:pPr>
+            <w:r>
+              <w:rPr>
+                <w:rFonts w:ascii="Arial" w:hAnsi="Arial" w:cs="Bahij TheSansArabic Plain"/>
+                <w:b w:val="0"/>
+                <w:color w:val="242235"/>
+                <w:sz w:val="18"/>
+              </w:rPr>
+            </w:r>
             <w:r>
               <w:rPr>
                 <w:rFonts w:ascii="Bahij TheSansArabic Plain" w:hAnsi="Bahij TheSansArabic Plain" w:cs="Bahij TheSansArabic Plain"/>
@@ -2806,15 +2981,17 @@
                 <w:rtl/>
                 <w:szCs w:val="19"/>
               </w:rPr>
-              <w:t>المدينة</w:t>
-            </w:r>
-          </w:p>
-          <w:p>
-            <w:pPr>
-              <w:keepNext w:val="0"/>
-              <w:spacing w:before="0" w:after="0" w:line="220" w:lineRule="exact"/>
-              <w:jc w:val="left"/>
-            </w:pPr>
+              <w:t>⁧المدينة⁩</w:t>
+            </w:r>
+            <w:r>
+              <w:rPr>
+                <w:rFonts w:ascii="Arial" w:hAnsi="Arial" w:cs="Bahij TheSansArabic Plain"/>
+                <w:b w:val="0"/>
+                <w:color w:val="656575"/>
+                <w:sz w:val="16"/>
+              </w:rPr>
+              <w:t xml:space="preserve"> / </w:t>
+            </w:r>
             <w:r>
               <w:rPr>
                 <w:rFonts w:ascii="Arial" w:hAnsi="Arial" w:cs="Bahij TheSansArabic Plain"/>
@@ -2822,7 +2999,7 @@
                 <w:color w:val="656575"/>
                 <w:sz w:val="15"/>
               </w:rPr>
-              <w:t>City</w:t>
+              <w:t>⁦City⁩</w:t>
             </w:r>
           </w:p>
           <w:p>
@@ -2864,10 +3041,17 @@
           <w:p>
             <w:pPr>
               <w:keepNext w:val="0"/>
-              <w:spacing w:before="0" w:after="0" w:line="260" w:lineRule="exact"/>
-              <w:jc w:val="start"/>
-              <w:bidi/>
+              <w:spacing w:before="0" w:after="0" w:line="280" w:lineRule="exact"/>
+              <w:jc w:val="left"/>
             </w:pPr>
+            <w:r>
+              <w:rPr>
+                <w:rFonts w:ascii="Arial" w:hAnsi="Arial" w:cs="Bahij TheSansArabic Plain"/>
+                <w:b w:val="0"/>
+                <w:color w:val="242235"/>
+                <w:sz w:val="18"/>
+              </w:rPr>
+            </w:r>
             <w:r>
               <w:rPr>
                 <w:rFonts w:ascii="Bahij TheSansArabic Plain" w:hAnsi="Bahij TheSansArabic Plain" w:cs="Bahij TheSansArabic Plain"/>
@@ -2877,15 +3061,17 @@
                 <w:rtl/>
                 <w:szCs w:val="19"/>
               </w:rPr>
-              <w:t>الدولة</w:t>
-            </w:r>
-          </w:p>
-          <w:p>
-            <w:pPr>
-              <w:keepNext w:val="0"/>
-              <w:spacing w:before="0" w:after="0" w:line="220" w:lineRule="exact"/>
-              <w:jc w:val="left"/>
-            </w:pPr>
+              <w:t>⁧الدولة⁩</w:t>
+            </w:r>
+            <w:r>
+              <w:rPr>
+                <w:rFonts w:ascii="Arial" w:hAnsi="Arial" w:cs="Bahij TheSansArabic Plain"/>
+                <w:b w:val="0"/>
+                <w:color w:val="656575"/>
+                <w:sz w:val="16"/>
+              </w:rPr>
+              <w:t xml:space="preserve"> / </w:t>
+            </w:r>
             <w:r>
               <w:rPr>
                 <w:rFonts w:ascii="Arial" w:hAnsi="Arial" w:cs="Bahij TheSansArabic Plain"/>
@@ -2893,7 +3079,7 @@
                 <w:color w:val="656575"/>
                 <w:sz w:val="15"/>
               </w:rPr>
-              <w:t>Country</w:t>
+              <w:t>⁦Country⁩</w:t>
             </w:r>
           </w:p>
           <w:p>
@@ -3035,10 +3221,17 @@
           <w:p>
             <w:pPr>
               <w:keepNext w:val="0"/>
-              <w:spacing w:before="0" w:after="0" w:line="260" w:lineRule="exact"/>
-              <w:jc w:val="start"/>
-              <w:bidi/>
+              <w:spacing w:before="0" w:after="0" w:line="280" w:lineRule="exact"/>
+              <w:jc w:val="left"/>
             </w:pPr>
+            <w:r>
+              <w:rPr>
+                <w:rFonts w:ascii="Arial" w:hAnsi="Arial" w:cs="Bahij TheSansArabic Plain"/>
+                <w:b w:val="0"/>
+                <w:color w:val="242235"/>
+                <w:sz w:val="18"/>
+              </w:rPr>
+            </w:r>
             <w:r>
               <w:rPr>
                 <w:rFonts w:ascii="Bahij TheSansArabic Plain" w:hAnsi="Bahij TheSansArabic Plain" w:cs="Bahij TheSansArabic Plain"/>
@@ -3048,15 +3241,17 @@
                 <w:rtl/>
                 <w:szCs w:val="19"/>
               </w:rPr>
-              <w:t>المبنى</w:t>
-            </w:r>
-          </w:p>
-          <w:p>
-            <w:pPr>
-              <w:keepNext w:val="0"/>
-              <w:spacing w:before="0" w:after="0" w:line="220" w:lineRule="exact"/>
-              <w:jc w:val="left"/>
-            </w:pPr>
+              <w:t>⁧المبنى⁩</w:t>
+            </w:r>
+            <w:r>
+              <w:rPr>
+                <w:rFonts w:ascii="Arial" w:hAnsi="Arial" w:cs="Bahij TheSansArabic Plain"/>
+                <w:b w:val="0"/>
+                <w:color w:val="656575"/>
+                <w:sz w:val="16"/>
+              </w:rPr>
+              <w:t xml:space="preserve"> / </w:t>
+            </w:r>
             <w:r>
               <w:rPr>
                 <w:rFonts w:ascii="Arial" w:hAnsi="Arial" w:cs="Bahij TheSansArabic Plain"/>
@@ -3064,7 +3259,7 @@
                 <w:color w:val="656575"/>
                 <w:sz w:val="15"/>
               </w:rPr>
-              <w:t>Building #</w:t>
+              <w:t>⁦Building #⁩</w:t>
             </w:r>
           </w:p>
           <w:p>
@@ -3106,10 +3301,17 @@
           <w:p>
             <w:pPr>
               <w:keepNext w:val="0"/>
-              <w:spacing w:before="0" w:after="0" w:line="260" w:lineRule="exact"/>
-              <w:jc w:val="start"/>
-              <w:bidi/>
+              <w:spacing w:before="0" w:after="0" w:line="280" w:lineRule="exact"/>
+              <w:jc w:val="left"/>
             </w:pPr>
+            <w:r>
+              <w:rPr>
+                <w:rFonts w:ascii="Arial" w:hAnsi="Arial" w:cs="Bahij TheSansArabic Plain"/>
+                <w:b w:val="0"/>
+                <w:color w:val="242235"/>
+                <w:sz w:val="18"/>
+              </w:rPr>
+            </w:r>
             <w:r>
               <w:rPr>
                 <w:rFonts w:ascii="Bahij TheSansArabic Plain" w:hAnsi="Bahij TheSansArabic Plain" w:cs="Bahij TheSansArabic Plain"/>
@@ -3119,15 +3321,17 @@
                 <w:rtl/>
                 <w:szCs w:val="19"/>
               </w:rPr>
-              <w:t>اسم الشارع</w:t>
-            </w:r>
-          </w:p>
-          <w:p>
-            <w:pPr>
-              <w:keepNext w:val="0"/>
-              <w:spacing w:before="0" w:after="0" w:line="220" w:lineRule="exact"/>
-              <w:jc w:val="left"/>
-            </w:pPr>
+              <w:t>⁧اسم الشارع⁩</w:t>
+            </w:r>
+            <w:r>
+              <w:rPr>
+                <w:rFonts w:ascii="Arial" w:hAnsi="Arial" w:cs="Bahij TheSansArabic Plain"/>
+                <w:b w:val="0"/>
+                <w:color w:val="656575"/>
+                <w:sz w:val="16"/>
+              </w:rPr>
+              <w:t xml:space="preserve"> / </w:t>
+            </w:r>
             <w:r>
               <w:rPr>
                 <w:rFonts w:ascii="Arial" w:hAnsi="Arial" w:cs="Bahij TheSansArabic Plain"/>
@@ -3135,7 +3339,7 @@
                 <w:color w:val="656575"/>
                 <w:sz w:val="15"/>
               </w:rPr>
-              <w:t>Street Name</w:t>
+              <w:t>⁦Street Name⁩</w:t>
             </w:r>
           </w:p>
           <w:p>
@@ -3218,10 +3422,17 @@
           <w:p>
             <w:pPr>
               <w:keepNext w:val="0"/>
-              <w:spacing w:before="0" w:after="0" w:line="260" w:lineRule="exact"/>
-              <w:jc w:val="start"/>
-              <w:bidi/>
+              <w:spacing w:before="0" w:after="0" w:line="280" w:lineRule="exact"/>
+              <w:jc w:val="left"/>
             </w:pPr>
+            <w:r>
+              <w:rPr>
+                <w:rFonts w:ascii="Arial" w:hAnsi="Arial" w:cs="Bahij TheSansArabic Plain"/>
+                <w:b w:val="0"/>
+                <w:color w:val="242235"/>
+                <w:sz w:val="18"/>
+              </w:rPr>
+            </w:r>
             <w:r>
               <w:rPr>
                 <w:rFonts w:ascii="Bahij TheSansArabic Plain" w:hAnsi="Bahij TheSansArabic Plain" w:cs="Bahij TheSansArabic Plain"/>
@@ -3231,15 +3442,17 @@
                 <w:rtl/>
                 <w:szCs w:val="19"/>
               </w:rPr>
-              <w:t>المنطقة</w:t>
-            </w:r>
-          </w:p>
-          <w:p>
-            <w:pPr>
-              <w:keepNext w:val="0"/>
-              <w:spacing w:before="0" w:after="0" w:line="220" w:lineRule="exact"/>
-              <w:jc w:val="left"/>
-            </w:pPr>
+              <w:t>⁧المنطقة⁩</w:t>
+            </w:r>
+            <w:r>
+              <w:rPr>
+                <w:rFonts w:ascii="Arial" w:hAnsi="Arial" w:cs="Bahij TheSansArabic Plain"/>
+                <w:b w:val="0"/>
+                <w:color w:val="656575"/>
+                <w:sz w:val="16"/>
+              </w:rPr>
+              <w:t xml:space="preserve"> / </w:t>
+            </w:r>
             <w:r>
               <w:rPr>
                 <w:rFonts w:ascii="Arial" w:hAnsi="Arial" w:cs="Bahij TheSansArabic Plain"/>
@@ -3247,7 +3460,7 @@
                 <w:color w:val="656575"/>
                 <w:sz w:val="15"/>
               </w:rPr>
-              <w:t>District</w:t>
+              <w:t>⁦District⁩</w:t>
             </w:r>
           </w:p>
           <w:p>
@@ -3289,10 +3502,17 @@
           <w:p>
             <w:pPr>
               <w:keepNext w:val="0"/>
-              <w:spacing w:before="0" w:after="0" w:line="260" w:lineRule="exact"/>
-              <w:jc w:val="start"/>
-              <w:bidi/>
+              <w:spacing w:before="0" w:after="0" w:line="280" w:lineRule="exact"/>
+              <w:jc w:val="left"/>
             </w:pPr>
+            <w:r>
+              <w:rPr>
+                <w:rFonts w:ascii="Arial" w:hAnsi="Arial" w:cs="Bahij TheSansArabic Plain"/>
+                <w:b w:val="0"/>
+                <w:color w:val="242235"/>
+                <w:sz w:val="18"/>
+              </w:rPr>
+            </w:r>
             <w:r>
               <w:rPr>
                 <w:rFonts w:ascii="Bahij TheSansArabic Plain" w:hAnsi="Bahij TheSansArabic Plain" w:cs="Bahij TheSansArabic Plain"/>
@@ -3302,15 +3522,17 @@
                 <w:rtl/>
                 <w:szCs w:val="19"/>
               </w:rPr>
-              <w:t>الرمز البريدي</w:t>
-            </w:r>
-          </w:p>
-          <w:p>
-            <w:pPr>
-              <w:keepNext w:val="0"/>
-              <w:spacing w:before="0" w:after="0" w:line="220" w:lineRule="exact"/>
-              <w:jc w:val="left"/>
-            </w:pPr>
+              <w:t>⁧الرمز البريدي⁩</w:t>
+            </w:r>
+            <w:r>
+              <w:rPr>
+                <w:rFonts w:ascii="Arial" w:hAnsi="Arial" w:cs="Bahij TheSansArabic Plain"/>
+                <w:b w:val="0"/>
+                <w:color w:val="656575"/>
+                <w:sz w:val="16"/>
+              </w:rPr>
+              <w:t xml:space="preserve"> / </w:t>
+            </w:r>
             <w:r>
               <w:rPr>
                 <w:rFonts w:ascii="Arial" w:hAnsi="Arial" w:cs="Bahij TheSansArabic Plain"/>
@@ -3318,7 +3540,7 @@
                 <w:color w:val="656575"/>
                 <w:sz w:val="15"/>
               </w:rPr>
-              <w:t>Postal Code</w:t>
+              <w:t>⁦Postal Code⁩</w:t>
             </w:r>
           </w:p>
           <w:p>
@@ -3401,10 +3623,17 @@
           <w:p>
             <w:pPr>
               <w:keepNext w:val="0"/>
-              <w:spacing w:before="0" w:after="0" w:line="260" w:lineRule="exact"/>
-              <w:jc w:val="start"/>
-              <w:bidi/>
+              <w:spacing w:before="0" w:after="0" w:line="280" w:lineRule="exact"/>
+              <w:jc w:val="left"/>
             </w:pPr>
+            <w:r>
+              <w:rPr>
+                <w:rFonts w:ascii="Arial" w:hAnsi="Arial" w:cs="Bahij TheSansArabic Plain"/>
+                <w:b w:val="0"/>
+                <w:color w:val="242235"/>
+                <w:sz w:val="18"/>
+              </w:rPr>
+            </w:r>
             <w:r>
               <w:rPr>
                 <w:rFonts w:ascii="Bahij TheSansArabic Plain" w:hAnsi="Bahij TheSansArabic Plain" w:cs="Bahij TheSansArabic Plain"/>
@@ -3414,15 +3643,17 @@
                 <w:rtl/>
                 <w:szCs w:val="19"/>
               </w:rPr>
-              <w:t>المدينة</w:t>
-            </w:r>
-          </w:p>
-          <w:p>
-            <w:pPr>
-              <w:keepNext w:val="0"/>
-              <w:spacing w:before="0" w:after="0" w:line="220" w:lineRule="exact"/>
-              <w:jc w:val="left"/>
-            </w:pPr>
+              <w:t>⁧المدينة⁩</w:t>
+            </w:r>
+            <w:r>
+              <w:rPr>
+                <w:rFonts w:ascii="Arial" w:hAnsi="Arial" w:cs="Bahij TheSansArabic Plain"/>
+                <w:b w:val="0"/>
+                <w:color w:val="656575"/>
+                <w:sz w:val="16"/>
+              </w:rPr>
+              <w:t xml:space="preserve"> / </w:t>
+            </w:r>
             <w:r>
               <w:rPr>
                 <w:rFonts w:ascii="Arial" w:hAnsi="Arial" w:cs="Bahij TheSansArabic Plain"/>
@@ -3430,7 +3661,7 @@
                 <w:color w:val="656575"/>
                 <w:sz w:val="15"/>
               </w:rPr>
-              <w:t>City</w:t>
+              <w:t>⁦City⁩</w:t>
             </w:r>
           </w:p>
           <w:p>
@@ -3472,10 +3703,17 @@
           <w:p>
             <w:pPr>
               <w:keepNext w:val="0"/>
-              <w:spacing w:before="0" w:after="0" w:line="260" w:lineRule="exact"/>
-              <w:jc w:val="start"/>
-              <w:bidi/>
+              <w:spacing w:before="0" w:after="0" w:line="280" w:lineRule="exact"/>
+              <w:jc w:val="left"/>
             </w:pPr>
+            <w:r>
+              <w:rPr>
+                <w:rFonts w:ascii="Arial" w:hAnsi="Arial" w:cs="Bahij TheSansArabic Plain"/>
+                <w:b w:val="0"/>
+                <w:color w:val="242235"/>
+                <w:sz w:val="18"/>
+              </w:rPr>
+            </w:r>
             <w:r>
               <w:rPr>
                 <w:rFonts w:ascii="Bahij TheSansArabic Plain" w:hAnsi="Bahij TheSansArabic Plain" w:cs="Bahij TheSansArabic Plain"/>
@@ -3485,15 +3723,17 @@
                 <w:rtl/>
                 <w:szCs w:val="19"/>
               </w:rPr>
-              <w:t>الدولة</w:t>
-            </w:r>
-          </w:p>
-          <w:p>
-            <w:pPr>
-              <w:keepNext w:val="0"/>
-              <w:spacing w:before="0" w:after="0" w:line="220" w:lineRule="exact"/>
-              <w:jc w:val="left"/>
-            </w:pPr>
+              <w:t>⁧الدولة⁩</w:t>
+            </w:r>
+            <w:r>
+              <w:rPr>
+                <w:rFonts w:ascii="Arial" w:hAnsi="Arial" w:cs="Bahij TheSansArabic Plain"/>
+                <w:b w:val="0"/>
+                <w:color w:val="656575"/>
+                <w:sz w:val="16"/>
+              </w:rPr>
+              <w:t xml:space="preserve"> / </w:t>
+            </w:r>
             <w:r>
               <w:rPr>
                 <w:rFonts w:ascii="Arial" w:hAnsi="Arial" w:cs="Bahij TheSansArabic Plain"/>
@@ -3501,7 +3741,7 @@
                 <w:color w:val="656575"/>
                 <w:sz w:val="15"/>
               </w:rPr>
-              <w:t>Country</w:t>
+              <w:t>⁦Country⁩</w:t>
             </w:r>
           </w:p>
           <w:p>
@@ -3666,10 +3906,17 @@
           <w:p>
             <w:pPr>
               <w:keepNext w:val="0"/>
-              <w:spacing w:before="0" w:after="0" w:line="260" w:lineRule="exact"/>
-              <w:jc w:val="start"/>
-              <w:bidi/>
+              <w:spacing w:before="0" w:after="0" w:line="280" w:lineRule="exact"/>
+              <w:jc w:val="left"/>
             </w:pPr>
+            <w:r>
+              <w:rPr>
+                <w:rFonts w:ascii="Arial" w:hAnsi="Arial" w:cs="Bahij TheSansArabic Plain"/>
+                <w:b w:val="0"/>
+                <w:color w:val="242235"/>
+                <w:sz w:val="18"/>
+              </w:rPr>
+            </w:r>
             <w:r>
               <w:rPr>
                 <w:rFonts w:ascii="Bahij TheSansArabic Plain" w:hAnsi="Bahij TheSansArabic Plain" w:cs="Bahij TheSansArabic Plain"/>
@@ -3680,15 +3927,8 @@
                 <w:szCs w:val="19"/>
                 <w:bCs/>
               </w:rPr>
-              <w:t>هل أنت شخص من الولايات المتحدة الأمريكية؟</w:t>
-            </w:r>
-          </w:p>
-          <w:p>
-            <w:pPr>
-              <w:keepNext w:val="0"/>
-              <w:spacing w:before="0" w:after="0" w:line="240" w:lineRule="exact"/>
-              <w:jc w:val="left"/>
-            </w:pPr>
+              <w:t>⁧هل أنت شخص من الولايات المتحدة الأمريكية؟⁩</w:t>
+            </w:r>
             <w:r>
               <w:rPr>
                 <w:rFonts w:ascii="Arial" w:hAnsi="Arial" w:cs="Bahij TheSansArabic Plain"/>
@@ -3696,7 +3936,16 @@
                 <w:color w:val="656575"/>
                 <w:sz w:val="16"/>
               </w:rPr>
-              <w:t>Are you a US person?</w:t>
+              <w:t xml:space="preserve"> / </w:t>
+            </w:r>
+            <w:r>
+              <w:rPr>
+                <w:rFonts w:ascii="Arial" w:hAnsi="Arial" w:cs="Bahij TheSansArabic Plain"/>
+                <w:b w:val="0"/>
+                <w:color w:val="656575"/>
+                <w:sz w:val="16"/>
+              </w:rPr>
+              <w:t>⁦Are you a US person?⁩</w:t>
             </w:r>
           </w:p>
           <w:p>
@@ -3793,23 +4042,6 @@
                   </w:r>
                   <w:r>
                     <w:rPr>
-                      <w:rFonts w:ascii="Arial" w:hAnsi="Arial" w:cs="Bahij TheSansArabic Plain"/>
-                      <w:b w:val="0"/>
-                      <w:color w:val="242235"/>
-                      <w:sz w:val="16"/>
-                    </w:rPr>
-                    <w:t>Yes</w:t>
-                  </w:r>
-                </w:p>
-                <w:p>
-                  <w:pPr>
-                    <w:keepNext w:val="0"/>
-                    <w:spacing w:before="0" w:after="0" w:line="260" w:lineRule="exact"/>
-                    <w:jc w:val="start"/>
-                    <w:bidi/>
-                  </w:pPr>
-                  <w:r>
-                    <w:rPr>
                       <w:rFonts w:ascii="Bahij TheSansArabic Plain" w:hAnsi="Bahij TheSansArabic Plain" w:cs="Bahij TheSansArabic Plain"/>
                       <w:b w:val="0"/>
                       <w:color w:val="242235"/>
@@ -3817,7 +4049,25 @@
                       <w:rtl/>
                       <w:szCs w:val="18"/>
                     </w:rPr>
-                    <w:t>نعم</w:t>
+                    <w:t>⁧نعم⁩</w:t>
+                  </w:r>
+                  <w:r>
+                    <w:rPr>
+                      <w:rFonts w:ascii="Arial" w:hAnsi="Arial" w:cs="Bahij TheSansArabic Plain"/>
+                      <w:b w:val="0"/>
+                      <w:color w:val="242235"/>
+                      <w:sz w:val="16"/>
+                    </w:rPr>
+                    <w:t xml:space="preserve"> / </w:t>
+                  </w:r>
+                  <w:r>
+                    <w:rPr>
+                      <w:rFonts w:ascii="Arial" w:hAnsi="Arial" w:cs="Bahij TheSansArabic Plain"/>
+                      <w:b w:val="0"/>
+                      <w:color w:val="242235"/>
+                      <w:sz w:val="16"/>
+                    </w:rPr>
+                    <w:t>⁦Yes⁩</w:t>
                   </w:r>
                 </w:p>
               </w:tc>
@@ -3857,23 +4107,6 @@
                   </w:r>
                   <w:r>
                     <w:rPr>
-                      <w:rFonts w:ascii="Arial" w:hAnsi="Arial" w:cs="Bahij TheSansArabic Plain"/>
-                      <w:b w:val="0"/>
-                      <w:color w:val="242235"/>
-                      <w:sz w:val="16"/>
-                    </w:rPr>
-                    <w:t>No</w:t>
-                  </w:r>
-                </w:p>
-                <w:p>
-                  <w:pPr>
-                    <w:keepNext w:val="0"/>
-                    <w:spacing w:before="0" w:after="0" w:line="260" w:lineRule="exact"/>
-                    <w:jc w:val="start"/>
-                    <w:bidi/>
-                  </w:pPr>
-                  <w:r>
-                    <w:rPr>
                       <w:rFonts w:ascii="Bahij TheSansArabic Plain" w:hAnsi="Bahij TheSansArabic Plain" w:cs="Bahij TheSansArabic Plain"/>
                       <w:b w:val="0"/>
                       <w:color w:val="242235"/>
@@ -3881,7 +4114,25 @@
                       <w:rtl/>
                       <w:szCs w:val="18"/>
                     </w:rPr>
-                    <w:t>لا</w:t>
+                    <w:t>⁧لا⁩</w:t>
+                  </w:r>
+                  <w:r>
+                    <w:rPr>
+                      <w:rFonts w:ascii="Arial" w:hAnsi="Arial" w:cs="Bahij TheSansArabic Plain"/>
+                      <w:b w:val="0"/>
+                      <w:color w:val="242235"/>
+                      <w:sz w:val="16"/>
+                    </w:rPr>
+                    <w:t xml:space="preserve"> / </w:t>
+                  </w:r>
+                  <w:r>
+                    <w:rPr>
+                      <w:rFonts w:ascii="Arial" w:hAnsi="Arial" w:cs="Bahij TheSansArabic Plain"/>
+                      <w:b w:val="0"/>
+                      <w:color w:val="242235"/>
+                      <w:sz w:val="16"/>
+                    </w:rPr>
+                    <w:t>⁦No⁩</w:t>
                   </w:r>
                 </w:p>
               </w:tc>
@@ -4159,23 +4410,6 @@
                   </w:r>
                   <w:r>
                     <w:rPr>
-                      <w:rFonts w:ascii="Arial" w:hAnsi="Arial" w:cs="Bahij TheSansArabic Plain"/>
-                      <w:b w:val="0"/>
-                      <w:color w:val="242235"/>
-                      <w:sz w:val="16"/>
-                    </w:rPr>
-                    <w:t>Yes</w:t>
-                  </w:r>
-                </w:p>
-                <w:p>
-                  <w:pPr>
-                    <w:keepNext w:val="0"/>
-                    <w:spacing w:before="0" w:after="0" w:line="260" w:lineRule="exact"/>
-                    <w:jc w:val="start"/>
-                    <w:bidi/>
-                  </w:pPr>
-                  <w:r>
-                    <w:rPr>
                       <w:rFonts w:ascii="Bahij TheSansArabic Plain" w:hAnsi="Bahij TheSansArabic Plain" w:cs="Bahij TheSansArabic Plain"/>
                       <w:b w:val="0"/>
                       <w:color w:val="242235"/>
@@ -4183,7 +4417,25 @@
                       <w:rtl/>
                       <w:szCs w:val="18"/>
                     </w:rPr>
-                    <w:t>نعم</w:t>
+                    <w:t>⁧نعم⁩</w:t>
+                  </w:r>
+                  <w:r>
+                    <w:rPr>
+                      <w:rFonts w:ascii="Arial" w:hAnsi="Arial" w:cs="Bahij TheSansArabic Plain"/>
+                      <w:b w:val="0"/>
+                      <w:color w:val="242235"/>
+                      <w:sz w:val="16"/>
+                    </w:rPr>
+                    <w:t xml:space="preserve"> / </w:t>
+                  </w:r>
+                  <w:r>
+                    <w:rPr>
+                      <w:rFonts w:ascii="Arial" w:hAnsi="Arial" w:cs="Bahij TheSansArabic Plain"/>
+                      <w:b w:val="0"/>
+                      <w:color w:val="242235"/>
+                      <w:sz w:val="16"/>
+                    </w:rPr>
+                    <w:t>⁦Yes⁩</w:t>
                   </w:r>
                 </w:p>
               </w:tc>
@@ -4223,23 +4475,6 @@
                   </w:r>
                   <w:r>
                     <w:rPr>
-                      <w:rFonts w:ascii="Arial" w:hAnsi="Arial" w:cs="Bahij TheSansArabic Plain"/>
-                      <w:b w:val="0"/>
-                      <w:color w:val="242235"/>
-                      <w:sz w:val="16"/>
-                    </w:rPr>
-                    <w:t>No</w:t>
-                  </w:r>
-                </w:p>
-                <w:p>
-                  <w:pPr>
-                    <w:keepNext w:val="0"/>
-                    <w:spacing w:before="0" w:after="0" w:line="260" w:lineRule="exact"/>
-                    <w:jc w:val="start"/>
-                    <w:bidi/>
-                  </w:pPr>
-                  <w:r>
-                    <w:rPr>
                       <w:rFonts w:ascii="Bahij TheSansArabic Plain" w:hAnsi="Bahij TheSansArabic Plain" w:cs="Bahij TheSansArabic Plain"/>
                       <w:b w:val="0"/>
                       <w:color w:val="242235"/>
@@ -4247,7 +4482,25 @@
                       <w:rtl/>
                       <w:szCs w:val="18"/>
                     </w:rPr>
-                    <w:t>لا</w:t>
+                    <w:t>⁧لا⁩</w:t>
+                  </w:r>
+                  <w:r>
+                    <w:rPr>
+                      <w:rFonts w:ascii="Arial" w:hAnsi="Arial" w:cs="Bahij TheSansArabic Plain"/>
+                      <w:b w:val="0"/>
+                      <w:color w:val="242235"/>
+                      <w:sz w:val="16"/>
+                    </w:rPr>
+                    <w:t xml:space="preserve"> / </w:t>
+                  </w:r>
+                  <w:r>
+                    <w:rPr>
+                      <w:rFonts w:ascii="Arial" w:hAnsi="Arial" w:cs="Bahij TheSansArabic Plain"/>
+                      <w:b w:val="0"/>
+                      <w:color w:val="242235"/>
+                      <w:sz w:val="16"/>
+                    </w:rPr>
+                    <w:t>⁦No⁩</w:t>
                   </w:r>
                 </w:p>
               </w:tc>
@@ -4560,23 +4813,6 @@
                   </w:r>
                   <w:r>
                     <w:rPr>
-                      <w:rFonts w:ascii="Arial" w:hAnsi="Arial" w:cs="Bahij TheSansArabic Plain"/>
-                      <w:b w:val="0"/>
-                      <w:color w:val="242235"/>
-                      <w:sz w:val="16"/>
-                    </w:rPr>
-                    <w:t>Yes</w:t>
-                  </w:r>
-                </w:p>
-                <w:p>
-                  <w:pPr>
-                    <w:keepNext w:val="0"/>
-                    <w:spacing w:before="0" w:after="0" w:line="260" w:lineRule="exact"/>
-                    <w:jc w:val="start"/>
-                    <w:bidi/>
-                  </w:pPr>
-                  <w:r>
-                    <w:rPr>
                       <w:rFonts w:ascii="Bahij TheSansArabic Plain" w:hAnsi="Bahij TheSansArabic Plain" w:cs="Bahij TheSansArabic Plain"/>
                       <w:b w:val="0"/>
                       <w:color w:val="242235"/>
@@ -4584,7 +4820,25 @@
                       <w:rtl/>
                       <w:szCs w:val="18"/>
                     </w:rPr>
-                    <w:t>نعم</w:t>
+                    <w:t>⁧نعم⁩</w:t>
+                  </w:r>
+                  <w:r>
+                    <w:rPr>
+                      <w:rFonts w:ascii="Arial" w:hAnsi="Arial" w:cs="Bahij TheSansArabic Plain"/>
+                      <w:b w:val="0"/>
+                      <w:color w:val="242235"/>
+                      <w:sz w:val="16"/>
+                    </w:rPr>
+                    <w:t xml:space="preserve"> / </w:t>
+                  </w:r>
+                  <w:r>
+                    <w:rPr>
+                      <w:rFonts w:ascii="Arial" w:hAnsi="Arial" w:cs="Bahij TheSansArabic Plain"/>
+                      <w:b w:val="0"/>
+                      <w:color w:val="242235"/>
+                      <w:sz w:val="16"/>
+                    </w:rPr>
+                    <w:t>⁦Yes⁩</w:t>
                   </w:r>
                 </w:p>
               </w:tc>
@@ -4624,23 +4878,6 @@
                   </w:r>
                   <w:r>
                     <w:rPr>
-                      <w:rFonts w:ascii="Arial" w:hAnsi="Arial" w:cs="Bahij TheSansArabic Plain"/>
-                      <w:b w:val="0"/>
-                      <w:color w:val="242235"/>
-                      <w:sz w:val="16"/>
-                    </w:rPr>
-                    <w:t>No</w:t>
-                  </w:r>
-                </w:p>
-                <w:p>
-                  <w:pPr>
-                    <w:keepNext w:val="0"/>
-                    <w:spacing w:before="0" w:after="0" w:line="260" w:lineRule="exact"/>
-                    <w:jc w:val="start"/>
-                    <w:bidi/>
-                  </w:pPr>
-                  <w:r>
-                    <w:rPr>
                       <w:rFonts w:ascii="Bahij TheSansArabic Plain" w:hAnsi="Bahij TheSansArabic Plain" w:cs="Bahij TheSansArabic Plain"/>
                       <w:b w:val="0"/>
                       <w:color w:val="242235"/>
@@ -4648,7 +4885,25 @@
                       <w:rtl/>
                       <w:szCs w:val="18"/>
                     </w:rPr>
-                    <w:t>لا</w:t>
+                    <w:t>⁧لا⁩</w:t>
+                  </w:r>
+                  <w:r>
+                    <w:rPr>
+                      <w:rFonts w:ascii="Arial" w:hAnsi="Arial" w:cs="Bahij TheSansArabic Plain"/>
+                      <w:b w:val="0"/>
+                      <w:color w:val="242235"/>
+                      <w:sz w:val="16"/>
+                    </w:rPr>
+                    <w:t xml:space="preserve"> / </w:t>
+                  </w:r>
+                  <w:r>
+                    <w:rPr>
+                      <w:rFonts w:ascii="Arial" w:hAnsi="Arial" w:cs="Bahij TheSansArabic Plain"/>
+                      <w:b w:val="0"/>
+                      <w:color w:val="242235"/>
+                      <w:sz w:val="16"/>
+                    </w:rPr>
+                    <w:t>⁦No⁩</w:t>
                   </w:r>
                 </w:p>
               </w:tc>
@@ -5614,10 +5869,17 @@
           <w:p>
             <w:pPr>
               <w:keepNext w:val="0"/>
-              <w:spacing w:before="0" w:after="0" w:line="260" w:lineRule="exact"/>
-              <w:jc w:val="start"/>
-              <w:bidi/>
+              <w:spacing w:before="0" w:after="0" w:line="280" w:lineRule="exact"/>
+              <w:jc w:val="left"/>
             </w:pPr>
+            <w:r>
+              <w:rPr>
+                <w:rFonts w:ascii="Arial" w:hAnsi="Arial" w:cs="Bahij TheSansArabic Plain"/>
+                <w:b w:val="0"/>
+                <w:color w:val="242235"/>
+                <w:sz w:val="18"/>
+              </w:rPr>
+            </w:r>
             <w:r>
               <w:rPr>
                 <w:rFonts w:ascii="Bahij TheSansArabic Plain" w:hAnsi="Bahij TheSansArabic Plain" w:cs="Bahij TheSansArabic Plain"/>
@@ -5627,15 +5889,17 @@
                 <w:rtl/>
                 <w:szCs w:val="19"/>
               </w:rPr>
-              <w:t>البلد/ الولاية القضائية</w:t>
-            </w:r>
-          </w:p>
-          <w:p>
-            <w:pPr>
-              <w:keepNext w:val="0"/>
-              <w:spacing w:before="0" w:after="0" w:line="220" w:lineRule="exact"/>
-              <w:jc w:val="left"/>
-            </w:pPr>
+              <w:t>⁧البلد/ الولاية القضائية⁩</w:t>
+            </w:r>
+            <w:r>
+              <w:rPr>
+                <w:rFonts w:ascii="Arial" w:hAnsi="Arial" w:cs="Bahij TheSansArabic Plain"/>
+                <w:b w:val="0"/>
+                <w:color w:val="656575"/>
+                <w:sz w:val="16"/>
+              </w:rPr>
+              <w:t xml:space="preserve"> / </w:t>
+            </w:r>
             <w:r>
               <w:rPr>
                 <w:rFonts w:ascii="Arial" w:hAnsi="Arial" w:cs="Bahij TheSansArabic Plain"/>
@@ -5643,7 +5907,7 @@
                 <w:color w:val="656575"/>
                 <w:sz w:val="15"/>
               </w:rPr>
-              <w:t>Country/jurisdiction</w:t>
+              <w:t>⁦Country/jurisdiction⁩</w:t>
             </w:r>
           </w:p>
           <w:p>
@@ -5973,10 +6237,17 @@
           <w:p>
             <w:pPr>
               <w:keepNext w:val="0"/>
-              <w:spacing w:before="0" w:after="0" w:line="260" w:lineRule="exact"/>
-              <w:jc w:val="start"/>
-              <w:bidi/>
+              <w:spacing w:before="0" w:after="0" w:line="280" w:lineRule="exact"/>
+              <w:jc w:val="left"/>
             </w:pPr>
+            <w:r>
+              <w:rPr>
+                <w:rFonts w:ascii="Arial" w:hAnsi="Arial" w:cs="Bahij TheSansArabic Plain"/>
+                <w:b w:val="0"/>
+                <w:color w:val="242235"/>
+                <w:sz w:val="18"/>
+              </w:rPr>
+            </w:r>
             <w:r>
               <w:rPr>
                 <w:rFonts w:ascii="Bahij TheSansArabic Plain" w:hAnsi="Bahij TheSansArabic Plain" w:cs="Bahij TheSansArabic Plain"/>
@@ -5986,15 +6257,17 @@
                 <w:rtl/>
                 <w:szCs w:val="19"/>
               </w:rPr>
-              <w:t>البلد/ الولاية القضائية</w:t>
-            </w:r>
-          </w:p>
-          <w:p>
-            <w:pPr>
-              <w:keepNext w:val="0"/>
-              <w:spacing w:before="0" w:after="0" w:line="220" w:lineRule="exact"/>
-              <w:jc w:val="left"/>
-            </w:pPr>
+              <w:t>⁧البلد/ الولاية القضائية⁩</w:t>
+            </w:r>
+            <w:r>
+              <w:rPr>
+                <w:rFonts w:ascii="Arial" w:hAnsi="Arial" w:cs="Bahij TheSansArabic Plain"/>
+                <w:b w:val="0"/>
+                <w:color w:val="656575"/>
+                <w:sz w:val="16"/>
+              </w:rPr>
+              <w:t xml:space="preserve"> / </w:t>
+            </w:r>
             <w:r>
               <w:rPr>
                 <w:rFonts w:ascii="Arial" w:hAnsi="Arial" w:cs="Bahij TheSansArabic Plain"/>
@@ -6002,7 +6275,7 @@
                 <w:color w:val="656575"/>
                 <w:sz w:val="15"/>
               </w:rPr>
-              <w:t>Country/jurisdiction</w:t>
+              <w:t>⁦Country/jurisdiction⁩</w:t>
             </w:r>
           </w:p>
           <w:p>
@@ -6332,10 +6605,17 @@
           <w:p>
             <w:pPr>
               <w:keepNext w:val="0"/>
-              <w:spacing w:before="0" w:after="0" w:line="260" w:lineRule="exact"/>
-              <w:jc w:val="start"/>
-              <w:bidi/>
+              <w:spacing w:before="0" w:after="0" w:line="280" w:lineRule="exact"/>
+              <w:jc w:val="left"/>
             </w:pPr>
+            <w:r>
+              <w:rPr>
+                <w:rFonts w:ascii="Arial" w:hAnsi="Arial" w:cs="Bahij TheSansArabic Plain"/>
+                <w:b w:val="0"/>
+                <w:color w:val="242235"/>
+                <w:sz w:val="18"/>
+              </w:rPr>
+            </w:r>
             <w:r>
               <w:rPr>
                 <w:rFonts w:ascii="Bahij TheSansArabic Plain" w:hAnsi="Bahij TheSansArabic Plain" w:cs="Bahij TheSansArabic Plain"/>
@@ -6345,15 +6625,17 @@
                 <w:rtl/>
                 <w:szCs w:val="19"/>
               </w:rPr>
-              <w:t>البلد/ الولاية القضائية</w:t>
-            </w:r>
-          </w:p>
-          <w:p>
-            <w:pPr>
-              <w:keepNext w:val="0"/>
-              <w:spacing w:before="0" w:after="0" w:line="220" w:lineRule="exact"/>
-              <w:jc w:val="left"/>
-            </w:pPr>
+              <w:t>⁧البلد/ الولاية القضائية⁩</w:t>
+            </w:r>
+            <w:r>
+              <w:rPr>
+                <w:rFonts w:ascii="Arial" w:hAnsi="Arial" w:cs="Bahij TheSansArabic Plain"/>
+                <w:b w:val="0"/>
+                <w:color w:val="656575"/>
+                <w:sz w:val="16"/>
+              </w:rPr>
+              <w:t xml:space="preserve"> / </w:t>
+            </w:r>
             <w:r>
               <w:rPr>
                 <w:rFonts w:ascii="Arial" w:hAnsi="Arial" w:cs="Bahij TheSansArabic Plain"/>
@@ -6361,7 +6643,7 @@
                 <w:color w:val="656575"/>
                 <w:sz w:val="15"/>
               </w:rPr>
-              <w:t>Country/jurisdiction</w:t>
+              <w:t>⁦Country/jurisdiction⁩</w:t>
             </w:r>
           </w:p>
           <w:p>
@@ -7420,10 +7702,17 @@
           <w:p>
             <w:pPr>
               <w:keepNext w:val="0"/>
-              <w:spacing w:before="0" w:after="0" w:line="260" w:lineRule="exact"/>
-              <w:jc w:val="start"/>
-              <w:bidi/>
+              <w:spacing w:before="0" w:after="0" w:line="280" w:lineRule="exact"/>
+              <w:jc w:val="left"/>
             </w:pPr>
+            <w:r>
+              <w:rPr>
+                <w:rFonts w:ascii="Arial" w:hAnsi="Arial" w:cs="Bahij TheSansArabic Plain"/>
+                <w:b w:val="0"/>
+                <w:color w:val="242235"/>
+                <w:sz w:val="18"/>
+              </w:rPr>
+            </w:r>
             <w:r>
               <w:rPr>
                 <w:rFonts w:ascii="Bahij TheSansArabic Plain" w:hAnsi="Bahij TheSansArabic Plain" w:cs="Bahij TheSansArabic Plain"/>
@@ -7433,15 +7722,17 @@
                 <w:rtl/>
                 <w:szCs w:val="19"/>
               </w:rPr>
-              <w:t>اسم الموقع باللغة العربية</w:t>
-            </w:r>
-          </w:p>
-          <w:p>
-            <w:pPr>
-              <w:keepNext w:val="0"/>
-              <w:spacing w:before="0" w:after="0" w:line="220" w:lineRule="exact"/>
-              <w:jc w:val="left"/>
-            </w:pPr>
+              <w:t>⁧اسم الموقع باللغة العربية⁩</w:t>
+            </w:r>
+            <w:r>
+              <w:rPr>
+                <w:rFonts w:ascii="Arial" w:hAnsi="Arial" w:cs="Bahij TheSansArabic Plain"/>
+                <w:b w:val="0"/>
+                <w:color w:val="656575"/>
+                <w:sz w:val="16"/>
+              </w:rPr>
+              <w:t xml:space="preserve"> / </w:t>
+            </w:r>
             <w:r>
               <w:rPr>
                 <w:rFonts w:ascii="Arial" w:hAnsi="Arial" w:cs="Bahij TheSansArabic Plain"/>
@@ -7449,7 +7740,7 @@
                 <w:color w:val="656575"/>
                 <w:sz w:val="15"/>
               </w:rPr>
-              <w:t>Name of Signatory in Arabic</w:t>
+              <w:t>⁦Name of Signatory in Arabic⁩</w:t>
             </w:r>
           </w:p>
           <w:p>
@@ -7531,10 +7822,17 @@
           <w:p>
             <w:pPr>
               <w:keepNext w:val="0"/>
-              <w:spacing w:before="0" w:after="0" w:line="260" w:lineRule="exact"/>
-              <w:jc w:val="start"/>
-              <w:bidi/>
+              <w:spacing w:before="0" w:after="0" w:line="280" w:lineRule="exact"/>
+              <w:jc w:val="left"/>
             </w:pPr>
+            <w:r>
+              <w:rPr>
+                <w:rFonts w:ascii="Arial" w:hAnsi="Arial" w:cs="Bahij TheSansArabic Plain"/>
+                <w:b w:val="0"/>
+                <w:color w:val="242235"/>
+                <w:sz w:val="18"/>
+              </w:rPr>
+            </w:r>
             <w:r>
               <w:rPr>
                 <w:rFonts w:ascii="Bahij TheSansArabic Plain" w:hAnsi="Bahij TheSansArabic Plain" w:cs="Bahij TheSansArabic Plain"/>
@@ -7544,15 +7842,17 @@
                 <w:rtl/>
                 <w:szCs w:val="19"/>
               </w:rPr>
-              <w:t>اسم الموقع باللغة الإنجليزية</w:t>
-            </w:r>
-          </w:p>
-          <w:p>
-            <w:pPr>
-              <w:keepNext w:val="0"/>
-              <w:spacing w:before="0" w:after="0" w:line="220" w:lineRule="exact"/>
-              <w:jc w:val="left"/>
-            </w:pPr>
+              <w:t>⁧اسم الموقع باللغة الإنجليزية⁩</w:t>
+            </w:r>
+            <w:r>
+              <w:rPr>
+                <w:rFonts w:ascii="Arial" w:hAnsi="Arial" w:cs="Bahij TheSansArabic Plain"/>
+                <w:b w:val="0"/>
+                <w:color w:val="656575"/>
+                <w:sz w:val="16"/>
+              </w:rPr>
+              <w:t xml:space="preserve"> / </w:t>
+            </w:r>
             <w:r>
               <w:rPr>
                 <w:rFonts w:ascii="Arial" w:hAnsi="Arial" w:cs="Bahij TheSansArabic Plain"/>
@@ -7560,7 +7860,7 @@
                 <w:color w:val="656575"/>
                 <w:sz w:val="15"/>
               </w:rPr>
-              <w:t>Name of Signatory in English</w:t>
+              <w:t>⁦Name of Signatory in English⁩</w:t>
             </w:r>
           </w:p>
           <w:p>
@@ -7733,23 +8033,6 @@
                   </w:r>
                   <w:r>
                     <w:rPr>
-                      <w:rFonts w:ascii="Arial" w:hAnsi="Arial" w:cs="Bahij TheSansArabic Plain"/>
-                      <w:b w:val="0"/>
-                      <w:color w:val="242235"/>
-                      <w:sz w:val="16"/>
-                    </w:rPr>
-                    <w:t>Account Holder</w:t>
-                  </w:r>
-                </w:p>
-                <w:p>
-                  <w:pPr>
-                    <w:keepNext w:val="0"/>
-                    <w:spacing w:before="0" w:after="0" w:line="260" w:lineRule="exact"/>
-                    <w:jc w:val="start"/>
-                    <w:bidi/>
-                  </w:pPr>
-                  <w:r>
-                    <w:rPr>
                       <w:rFonts w:ascii="Bahij TheSansArabic Plain" w:hAnsi="Bahij TheSansArabic Plain" w:cs="Bahij TheSansArabic Plain"/>
                       <w:b w:val="0"/>
                       <w:color w:val="242235"/>
@@ -7757,7 +8040,25 @@
                       <w:rtl/>
                       <w:szCs w:val="18"/>
                     </w:rPr>
-                    <w:t>صاحب الحساب</w:t>
+                    <w:t>⁧صاحب الحساب⁩</w:t>
+                  </w:r>
+                  <w:r>
+                    <w:rPr>
+                      <w:rFonts w:ascii="Arial" w:hAnsi="Arial" w:cs="Bahij TheSansArabic Plain"/>
+                      <w:b w:val="0"/>
+                      <w:color w:val="242235"/>
+                      <w:sz w:val="16"/>
+                    </w:rPr>
+                    <w:t xml:space="preserve"> / </w:t>
+                  </w:r>
+                  <w:r>
+                    <w:rPr>
+                      <w:rFonts w:ascii="Arial" w:hAnsi="Arial" w:cs="Bahij TheSansArabic Plain"/>
+                      <w:b w:val="0"/>
+                      <w:color w:val="242235"/>
+                      <w:sz w:val="16"/>
+                    </w:rPr>
+                    <w:t>⁦Account Holder⁩</w:t>
                   </w:r>
                 </w:p>
               </w:tc>
@@ -7797,23 +8098,6 @@
                   </w:r>
                   <w:r>
                     <w:rPr>
-                      <w:rFonts w:ascii="Arial" w:hAnsi="Arial" w:cs="Bahij TheSansArabic Plain"/>
-                      <w:b w:val="0"/>
-                      <w:color w:val="242235"/>
-                      <w:sz w:val="16"/>
-                    </w:rPr>
-                    <w:t>Power of Attorney</w:t>
-                  </w:r>
-                </w:p>
-                <w:p>
-                  <w:pPr>
-                    <w:keepNext w:val="0"/>
-                    <w:spacing w:before="0" w:after="0" w:line="260" w:lineRule="exact"/>
-                    <w:jc w:val="start"/>
-                    <w:bidi/>
-                  </w:pPr>
-                  <w:r>
-                    <w:rPr>
                       <w:rFonts w:ascii="Bahij TheSansArabic Plain" w:hAnsi="Bahij TheSansArabic Plain" w:cs="Bahij TheSansArabic Plain"/>
                       <w:b w:val="0"/>
                       <w:color w:val="242235"/>
@@ -7821,7 +8105,25 @@
                       <w:rtl/>
                       <w:szCs w:val="18"/>
                     </w:rPr>
-                    <w:t>الوكيل</w:t>
+                    <w:t>⁧الوكيل⁩</w:t>
+                  </w:r>
+                  <w:r>
+                    <w:rPr>
+                      <w:rFonts w:ascii="Arial" w:hAnsi="Arial" w:cs="Bahij TheSansArabic Plain"/>
+                      <w:b w:val="0"/>
+                      <w:color w:val="242235"/>
+                      <w:sz w:val="16"/>
+                    </w:rPr>
+                    <w:t xml:space="preserve"> / </w:t>
+                  </w:r>
+                  <w:r>
+                    <w:rPr>
+                      <w:rFonts w:ascii="Arial" w:hAnsi="Arial" w:cs="Bahij TheSansArabic Plain"/>
+                      <w:b w:val="0"/>
+                      <w:color w:val="242235"/>
+                      <w:sz w:val="16"/>
+                    </w:rPr>
+                    <w:t>⁦Power of Attorney⁩</w:t>
                   </w:r>
                 </w:p>
               </w:tc>
@@ -7866,23 +8168,6 @@
                   </w:r>
                   <w:r>
                     <w:rPr>
-                      <w:rFonts w:ascii="Arial" w:hAnsi="Arial" w:cs="Bahij TheSansArabic Plain"/>
-                      <w:b w:val="0"/>
-                      <w:color w:val="242235"/>
-                      <w:sz w:val="16"/>
-                    </w:rPr>
-                    <w:t>Guardian</w:t>
-                  </w:r>
-                </w:p>
-                <w:p>
-                  <w:pPr>
-                    <w:keepNext w:val="0"/>
-                    <w:spacing w:before="0" w:after="0" w:line="260" w:lineRule="exact"/>
-                    <w:jc w:val="start"/>
-                    <w:bidi/>
-                  </w:pPr>
-                  <w:r>
-                    <w:rPr>
                       <w:rFonts w:ascii="Bahij TheSansArabic Plain" w:hAnsi="Bahij TheSansArabic Plain" w:cs="Bahij TheSansArabic Plain"/>
                       <w:b w:val="0"/>
                       <w:color w:val="242235"/>
@@ -7890,7 +8175,25 @@
                       <w:rtl/>
                       <w:szCs w:val="18"/>
                     </w:rPr>
-                    <w:t>الوصي</w:t>
+                    <w:t>⁧الوصي⁩</w:t>
+                  </w:r>
+                  <w:r>
+                    <w:rPr>
+                      <w:rFonts w:ascii="Arial" w:hAnsi="Arial" w:cs="Bahij TheSansArabic Plain"/>
+                      <w:b w:val="0"/>
+                      <w:color w:val="242235"/>
+                      <w:sz w:val="16"/>
+                    </w:rPr>
+                    <w:t xml:space="preserve"> / </w:t>
+                  </w:r>
+                  <w:r>
+                    <w:rPr>
+                      <w:rFonts w:ascii="Arial" w:hAnsi="Arial" w:cs="Bahij TheSansArabic Plain"/>
+                      <w:b w:val="0"/>
+                      <w:color w:val="242235"/>
+                      <w:sz w:val="16"/>
+                    </w:rPr>
+                    <w:t>⁦Guardian⁩</w:t>
                   </w:r>
                 </w:p>
               </w:tc>
@@ -7930,23 +8233,6 @@
                   </w:r>
                   <w:r>
                     <w:rPr>
-                      <w:rFonts w:ascii="Arial" w:hAnsi="Arial" w:cs="Bahij TheSansArabic Plain"/>
-                      <w:b w:val="0"/>
-                      <w:color w:val="242235"/>
-                      <w:sz w:val="16"/>
-                    </w:rPr>
-                    <w:t>Other (Please specify below)</w:t>
-                  </w:r>
-                </w:p>
-                <w:p>
-                  <w:pPr>
-                    <w:keepNext w:val="0"/>
-                    <w:spacing w:before="0" w:after="0" w:line="260" w:lineRule="exact"/>
-                    <w:jc w:val="start"/>
-                    <w:bidi/>
-                  </w:pPr>
-                  <w:r>
-                    <w:rPr>
                       <w:rFonts w:ascii="Bahij TheSansArabic Plain" w:hAnsi="Bahij TheSansArabic Plain" w:cs="Bahij TheSansArabic Plain"/>
                       <w:b w:val="0"/>
                       <w:color w:val="242235"/>
@@ -7954,7 +8240,25 @@
                       <w:rtl/>
                       <w:szCs w:val="18"/>
                     </w:rPr>
-                    <w:t>أخرى (يرجى التحديد أدناه)</w:t>
+                    <w:t>⁧أخرى (يرجى التحديد أدناه)⁩</w:t>
+                  </w:r>
+                  <w:r>
+                    <w:rPr>
+                      <w:rFonts w:ascii="Arial" w:hAnsi="Arial" w:cs="Bahij TheSansArabic Plain"/>
+                      <w:b w:val="0"/>
+                      <w:color w:val="242235"/>
+                      <w:sz w:val="16"/>
+                    </w:rPr>
+                    <w:t xml:space="preserve"> / </w:t>
+                  </w:r>
+                  <w:r>
+                    <w:rPr>
+                      <w:rFonts w:ascii="Arial" w:hAnsi="Arial" w:cs="Bahij TheSansArabic Plain"/>
+                      <w:b w:val="0"/>
+                      <w:color w:val="242235"/>
+                      <w:sz w:val="16"/>
+                    </w:rPr>
+                    <w:t>⁦Other (Please specify below)⁩</w:t>
                   </w:r>
                 </w:p>
               </w:tc>
@@ -8102,10 +8406,17 @@
           <w:p>
             <w:pPr>
               <w:keepNext w:val="0"/>
-              <w:spacing w:before="0" w:after="0" w:line="260" w:lineRule="exact"/>
-              <w:jc w:val="start"/>
-              <w:bidi/>
+              <w:spacing w:before="0" w:after="0" w:line="280" w:lineRule="exact"/>
+              <w:jc w:val="left"/>
             </w:pPr>
+            <w:r>
+              <w:rPr>
+                <w:rFonts w:ascii="Arial" w:hAnsi="Arial" w:cs="Bahij TheSansArabic Plain"/>
+                <w:b w:val="0"/>
+                <w:color w:val="242235"/>
+                <w:sz w:val="18"/>
+              </w:rPr>
+            </w:r>
             <w:r>
               <w:rPr>
                 <w:rFonts w:ascii="Bahij TheSansArabic Plain" w:hAnsi="Bahij TheSansArabic Plain" w:cs="Bahij TheSansArabic Plain"/>
@@ -8115,15 +8426,17 @@
                 <w:rtl/>
                 <w:szCs w:val="19"/>
               </w:rPr>
-              <w:t>التاريخ الميلادي</w:t>
-            </w:r>
-          </w:p>
-          <w:p>
-            <w:pPr>
-              <w:keepNext w:val="0"/>
-              <w:spacing w:before="0" w:after="0" w:line="220" w:lineRule="exact"/>
-              <w:jc w:val="left"/>
-            </w:pPr>
+              <w:t>⁧التاريخ الميلادي⁩</w:t>
+            </w:r>
+            <w:r>
+              <w:rPr>
+                <w:rFonts w:ascii="Arial" w:hAnsi="Arial" w:cs="Bahij TheSansArabic Plain"/>
+                <w:b w:val="0"/>
+                <w:color w:val="656575"/>
+                <w:sz w:val="16"/>
+              </w:rPr>
+              <w:t xml:space="preserve"> / </w:t>
+            </w:r>
             <w:r>
               <w:rPr>
                 <w:rFonts w:ascii="Arial" w:hAnsi="Arial" w:cs="Bahij TheSansArabic Plain"/>
@@ -8131,7 +8444,7 @@
                 <w:color w:val="656575"/>
                 <w:sz w:val="15"/>
               </w:rPr>
-              <w:t>Date (Gregorian)</w:t>
+              <w:t>⁦Date (Gregorian)⁩</w:t>
             </w:r>
           </w:p>
           <w:p>
@@ -8213,10 +8526,17 @@
           <w:p>
             <w:pPr>
               <w:keepNext w:val="0"/>
-              <w:spacing w:before="0" w:after="0" w:line="260" w:lineRule="exact"/>
-              <w:jc w:val="start"/>
-              <w:bidi/>
+              <w:spacing w:before="0" w:after="0" w:line="280" w:lineRule="exact"/>
+              <w:jc w:val="left"/>
             </w:pPr>
+            <w:r>
+              <w:rPr>
+                <w:rFonts w:ascii="Arial" w:hAnsi="Arial" w:cs="Bahij TheSansArabic Plain"/>
+                <w:b w:val="0"/>
+                <w:color w:val="242235"/>
+                <w:sz w:val="18"/>
+              </w:rPr>
+            </w:r>
             <w:r>
               <w:rPr>
                 <w:rFonts w:ascii="Bahij TheSansArabic Plain" w:hAnsi="Bahij TheSansArabic Plain" w:cs="Bahij TheSansArabic Plain"/>
@@ -8226,15 +8546,17 @@
                 <w:rtl/>
                 <w:szCs w:val="19"/>
               </w:rPr>
-              <w:t>توقيع الموقع</w:t>
-            </w:r>
-          </w:p>
-          <w:p>
-            <w:pPr>
-              <w:keepNext w:val="0"/>
-              <w:spacing w:before="0" w:after="0" w:line="220" w:lineRule="exact"/>
-              <w:jc w:val="left"/>
-            </w:pPr>
+              <w:t>⁧توقيع الموقع⁩</w:t>
+            </w:r>
+            <w:r>
+              <w:rPr>
+                <w:rFonts w:ascii="Arial" w:hAnsi="Arial" w:cs="Bahij TheSansArabic Plain"/>
+                <w:b w:val="0"/>
+                <w:color w:val="656575"/>
+                <w:sz w:val="16"/>
+              </w:rPr>
+              <w:t xml:space="preserve"> / </w:t>
+            </w:r>
             <w:r>
               <w:rPr>
                 <w:rFonts w:ascii="Arial" w:hAnsi="Arial" w:cs="Bahij TheSansArabic Plain"/>
@@ -8242,7 +8564,7 @@
                 <w:color w:val="656575"/>
                 <w:sz w:val="15"/>
               </w:rPr>
-              <w:t>Signatory signature</w:t>
+              <w:t>⁦Signatory signature⁩</w:t>
             </w:r>
           </w:p>
           <w:p>
@@ -8366,10 +8688,17 @@
           <w:p>
             <w:pPr>
               <w:keepNext w:val="0"/>
-              <w:spacing w:before="0" w:after="0" w:line="260" w:lineRule="exact"/>
-              <w:jc w:val="start"/>
-              <w:bidi/>
+              <w:spacing w:before="0" w:after="0" w:line="280" w:lineRule="exact"/>
+              <w:jc w:val="left"/>
             </w:pPr>
+            <w:r>
+              <w:rPr>
+                <w:rFonts w:ascii="Arial" w:hAnsi="Arial" w:cs="Bahij TheSansArabic Plain"/>
+                <w:b w:val="0"/>
+                <w:color w:val="242235"/>
+                <w:sz w:val="18"/>
+              </w:rPr>
+            </w:r>
             <w:r>
               <w:rPr>
                 <w:rFonts w:ascii="Bahij TheSansArabic Plain" w:hAnsi="Bahij TheSansArabic Plain" w:cs="Bahij TheSansArabic Plain"/>
@@ -8379,15 +8708,17 @@
                 <w:rtl/>
                 <w:szCs w:val="19"/>
               </w:rPr>
-              <w:t>الاسم الكامل لصاحب الحساب</w:t>
-            </w:r>
-          </w:p>
-          <w:p>
-            <w:pPr>
-              <w:keepNext w:val="0"/>
-              <w:spacing w:before="0" w:after="0" w:line="220" w:lineRule="exact"/>
-              <w:jc w:val="left"/>
-            </w:pPr>
+              <w:t>⁧الاسم الكامل لصاحب الحساب⁩</w:t>
+            </w:r>
+            <w:r>
+              <w:rPr>
+                <w:rFonts w:ascii="Arial" w:hAnsi="Arial" w:cs="Bahij TheSansArabic Plain"/>
+                <w:b w:val="0"/>
+                <w:color w:val="656575"/>
+                <w:sz w:val="16"/>
+              </w:rPr>
+              <w:t xml:space="preserve"> / </w:t>
+            </w:r>
             <w:r>
               <w:rPr>
                 <w:rFonts w:ascii="Arial" w:hAnsi="Arial" w:cs="Bahij TheSansArabic Plain"/>
@@ -8395,7 +8726,7 @@
                 <w:color w:val="656575"/>
                 <w:sz w:val="15"/>
               </w:rPr>
-              <w:t>Account holder full name</w:t>
+              <w:t>⁦Account holder full name⁩</w:t>
             </w:r>
           </w:p>
           <w:p>
@@ -8478,10 +8809,17 @@
           <w:p>
             <w:pPr>
               <w:keepNext w:val="0"/>
-              <w:spacing w:before="0" w:after="0" w:line="260" w:lineRule="exact"/>
-              <w:jc w:val="start"/>
-              <w:bidi/>
+              <w:spacing w:before="0" w:after="0" w:line="280" w:lineRule="exact"/>
+              <w:jc w:val="left"/>
             </w:pPr>
+            <w:r>
+              <w:rPr>
+                <w:rFonts w:ascii="Arial" w:hAnsi="Arial" w:cs="Bahij TheSansArabic Plain"/>
+                <w:b w:val="0"/>
+                <w:color w:val="242235"/>
+                <w:sz w:val="18"/>
+              </w:rPr>
+            </w:r>
             <w:r>
               <w:rPr>
                 <w:rFonts w:ascii="Bahij TheSansArabic Plain" w:hAnsi="Bahij TheSansArabic Plain" w:cs="Bahij TheSansArabic Plain"/>
@@ -8491,15 +8829,17 @@
                 <w:rtl/>
                 <w:szCs w:val="19"/>
               </w:rPr>
-              <w:t>الرقم الوظيفي</w:t>
-            </w:r>
-          </w:p>
-          <w:p>
-            <w:pPr>
-              <w:keepNext w:val="0"/>
-              <w:spacing w:before="0" w:after="0" w:line="220" w:lineRule="exact"/>
-              <w:jc w:val="left"/>
-            </w:pPr>
+              <w:t>⁧الرقم الوظيفي⁩</w:t>
+            </w:r>
+            <w:r>
+              <w:rPr>
+                <w:rFonts w:ascii="Arial" w:hAnsi="Arial" w:cs="Bahij TheSansArabic Plain"/>
+                <w:b w:val="0"/>
+                <w:color w:val="656575"/>
+                <w:sz w:val="16"/>
+              </w:rPr>
+              <w:t xml:space="preserve"> / </w:t>
+            </w:r>
             <w:r>
               <w:rPr>
                 <w:rFonts w:ascii="Arial" w:hAnsi="Arial" w:cs="Bahij TheSansArabic Plain"/>
@@ -8507,7 +8847,7 @@
                 <w:color w:val="656575"/>
                 <w:sz w:val="15"/>
               </w:rPr>
-              <w:t>Employee ID</w:t>
+              <w:t>⁦Employee ID⁩</w:t>
             </w:r>
           </w:p>
           <w:p>

</xml_diff>